<commit_message>
HW3: tighten findings and 3.3, correct wording against the results
- Section 3.3 and the three Section 6 findings rewritten in shorter
  sentences within the question limits, supporting numbers moved to tables
- "Starts at chance" corrected to match dev accuracy after epoch 0
- 6.1.3 now names the depth/learning-rate confound, 6.1.5 reports the
  saturation check as partial evidence, and final vs best accuracies fixed
- LeCun et al. (1998) attribution narrowed to what the paper states

Co-Authored-By: Claude Opus 5.5 <noreply@anthropic.com>
Claude-Session: https://claude.ai/code/session_01WbwbakQfUu5w66XipVgCSJ
</commit_message>
<xml_diff>
--- a/Onieal_HW3.docx
+++ b/Onieal_HW3.docx
@@ -13318,7 +13318,7 @@
         <w:t xml:space="preserve"> </w:t>
       </w:r>
       <w:r>
-        <w:t xml:space="preserve">Backpropagation computes the gradient at layer</w:t>
+        <w:t xml:space="preserve">Backpropagation multiplies one Jacobian per layer, so the gradient that reaches layer</w:t>
       </w:r>
       <w:r>
         <w:t xml:space="preserve"> </w:t>
@@ -13332,220 +13332,520 @@
         <w:t xml:space="preserve"> </w:t>
       </w:r>
       <w:r>
-        <w:t xml:space="preserve">as a product of one Jacobian per layer above it,</w:t>
-      </w:r>
-      <w:r>
-        <w:t xml:space="preserve"> </w:t>
-      </w:r>
-      <m:oMath>
-        <m:f>
-          <m:fPr>
-            <m:type m:val="bar"/>
-          </m:fPr>
-          <m:num>
-            <m:r>
-              <m:rPr>
-                <m:sty m:val="p"/>
-              </m:rPr>
-              <m:t>∂</m:t>
-            </m:r>
-            <m:r>
-              <m:rPr>
-                <m:sty m:val="p"/>
-                <m:scr m:val="script"/>
-              </m:rPr>
-              <m:t>L</m:t>
-            </m:r>
-          </m:num>
-          <m:den>
-            <m:r>
-              <m:rPr>
-                <m:sty m:val="p"/>
-              </m:rPr>
-              <m:t>∂</m:t>
-            </m:r>
-            <m:sSup>
-              <m:e>
-                <m:r>
-                  <m:rPr>
-                    <m:sty m:val="b"/>
-                  </m:rPr>
-                  <m:t>h</m:t>
-                </m:r>
-              </m:e>
-              <m:sup>
-                <m:d>
-                  <m:dPr>
-                    <m:begChr m:val="["/>
-                    <m:endChr m:val="]"/>
-                    <m:sepChr m:val=""/>
-                    <m:grow/>
-                  </m:dPr>
-                  <m:e>
-                    <m:r>
-                      <m:t>l</m:t>
-                    </m:r>
-                  </m:e>
-                </m:d>
-              </m:sup>
-            </m:sSup>
-          </m:den>
-        </m:f>
-        <m:r>
-          <m:rPr>
-            <m:sty m:val="p"/>
-          </m:rPr>
-          <m:t>=</m:t>
-        </m:r>
-        <m:f>
-          <m:fPr>
-            <m:type m:val="bar"/>
-          </m:fPr>
-          <m:num>
-            <m:r>
-              <m:rPr>
-                <m:sty m:val="p"/>
-              </m:rPr>
-              <m:t>∂</m:t>
-            </m:r>
-            <m:r>
-              <m:rPr>
-                <m:sty m:val="p"/>
-                <m:scr m:val="script"/>
-              </m:rPr>
-              <m:t>L</m:t>
-            </m:r>
-          </m:num>
-          <m:den>
-            <m:r>
-              <m:rPr>
-                <m:sty m:val="p"/>
-              </m:rPr>
-              <m:t>∂</m:t>
-            </m:r>
-            <m:sSup>
-              <m:e>
-                <m:r>
-                  <m:rPr>
-                    <m:sty m:val="b"/>
-                  </m:rPr>
-                  <m:t>h</m:t>
-                </m:r>
-              </m:e>
-              <m:sup>
-                <m:d>
-                  <m:dPr>
-                    <m:begChr m:val="["/>
-                    <m:endChr m:val="]"/>
-                    <m:sepChr m:val=""/>
-                    <m:grow/>
-                  </m:dPr>
-                  <m:e>
-                    <m:r>
-                      <m:t>L</m:t>
-                    </m:r>
-                  </m:e>
-                </m:d>
-              </m:sup>
-            </m:sSup>
-          </m:den>
-        </m:f>
-        <m:r>
-          <m:t> </m:t>
-        </m:r>
-        <m:sSup>
-          <m:e>
-            <m:r>
-              <m:t>J</m:t>
-            </m:r>
-          </m:e>
-          <m:sup>
-            <m:d>
-              <m:dPr>
-                <m:begChr m:val="["/>
-                <m:endChr m:val="]"/>
-                <m:sepChr m:val=""/>
-                <m:grow/>
-              </m:dPr>
-              <m:e>
-                <m:r>
-                  <m:t>L</m:t>
-                </m:r>
-              </m:e>
-            </m:d>
-          </m:sup>
-        </m:sSup>
-        <m:sSup>
-          <m:e>
-            <m:r>
-              <m:t>J</m:t>
-            </m:r>
-          </m:e>
-          <m:sup>
-            <m:d>
-              <m:dPr>
-                <m:begChr m:val="["/>
-                <m:endChr m:val="]"/>
-                <m:sepChr m:val=""/>
-                <m:grow/>
-              </m:dPr>
-              <m:e>
-                <m:r>
-                  <m:t>L</m:t>
-                </m:r>
-                <m:r>
-                  <m:rPr>
-                    <m:sty m:val="p"/>
-                  </m:rPr>
-                  <m:t>−</m:t>
-                </m:r>
-                <m:r>
-                  <m:t>1</m:t>
-                </m:r>
-              </m:e>
-            </m:d>
-          </m:sup>
-        </m:sSup>
-        <m:r>
-          <m:rPr>
-            <m:sty m:val="p"/>
-          </m:rPr>
-          <m:t>⋯</m:t>
-        </m:r>
-        <m:sSup>
-          <m:e>
-            <m:r>
-              <m:t>J</m:t>
-            </m:r>
-          </m:e>
-          <m:sup>
-            <m:d>
-              <m:dPr>
-                <m:begChr m:val="["/>
-                <m:endChr m:val="]"/>
-                <m:sepChr m:val=""/>
-                <m:grow/>
-              </m:dPr>
-              <m:e>
-                <m:r>
-                  <m:t>l</m:t>
-                </m:r>
-                <m:r>
-                  <m:rPr>
-                    <m:sty m:val="p"/>
-                  </m:rPr>
-                  <m:t>+</m:t>
-                </m:r>
-                <m:r>
-                  <m:t>1</m:t>
-                </m:r>
-              </m:e>
-            </m:d>
-          </m:sup>
-        </m:sSup>
-      </m:oMath>
-      <w:r>
-        <w:t xml:space="preserve">, where the chain rule applied to</w:t>
+        <w:t xml:space="preserve">is the product</w:t>
+      </w:r>
+    </w:p>
+    <w:p>
+      <w:pPr>
+        <w:pStyle w:val="BodyText"/>
+      </w:pPr>
+      <m:oMathPara>
+        <m:oMathParaPr>
+          <m:jc m:val="center"/>
+        </m:oMathParaPr>
+        <m:oMath>
+          <m:f>
+            <m:fPr>
+              <m:type m:val="bar"/>
+            </m:fPr>
+            <m:num>
+              <m:r>
+                <m:rPr>
+                  <m:sty m:val="p"/>
+                </m:rPr>
+                <m:t>∂</m:t>
+              </m:r>
+              <m:r>
+                <m:rPr>
+                  <m:sty m:val="p"/>
+                  <m:scr m:val="script"/>
+                </m:rPr>
+                <m:t>L</m:t>
+              </m:r>
+            </m:num>
+            <m:den>
+              <m:r>
+                <m:rPr>
+                  <m:sty m:val="p"/>
+                </m:rPr>
+                <m:t>∂</m:t>
+              </m:r>
+              <m:sSup>
+                <m:e>
+                  <m:r>
+                    <m:rPr>
+                      <m:sty m:val="b"/>
+                    </m:rPr>
+                    <m:t>h</m:t>
+                  </m:r>
+                </m:e>
+                <m:sup>
+                  <m:d>
+                    <m:dPr>
+                      <m:begChr m:val="["/>
+                      <m:endChr m:val="]"/>
+                      <m:sepChr m:val=""/>
+                      <m:grow/>
+                    </m:dPr>
+                    <m:e>
+                      <m:r>
+                        <m:t>l</m:t>
+                      </m:r>
+                    </m:e>
+                  </m:d>
+                </m:sup>
+              </m:sSup>
+            </m:den>
+          </m:f>
+          <m:r>
+            <m:rPr>
+              <m:sty m:val="p"/>
+            </m:rPr>
+            <m:t>=</m:t>
+          </m:r>
+          <m:f>
+            <m:fPr>
+              <m:type m:val="bar"/>
+            </m:fPr>
+            <m:num>
+              <m:r>
+                <m:rPr>
+                  <m:sty m:val="p"/>
+                </m:rPr>
+                <m:t>∂</m:t>
+              </m:r>
+              <m:r>
+                <m:rPr>
+                  <m:sty m:val="p"/>
+                  <m:scr m:val="script"/>
+                </m:rPr>
+                <m:t>L</m:t>
+              </m:r>
+            </m:num>
+            <m:den>
+              <m:r>
+                <m:rPr>
+                  <m:sty m:val="p"/>
+                </m:rPr>
+                <m:t>∂</m:t>
+              </m:r>
+              <m:sSup>
+                <m:e>
+                  <m:r>
+                    <m:rPr>
+                      <m:sty m:val="b"/>
+                    </m:rPr>
+                    <m:t>h</m:t>
+                  </m:r>
+                </m:e>
+                <m:sup>
+                  <m:d>
+                    <m:dPr>
+                      <m:begChr m:val="["/>
+                      <m:endChr m:val="]"/>
+                      <m:sepChr m:val=""/>
+                      <m:grow/>
+                    </m:dPr>
+                    <m:e>
+                      <m:r>
+                        <m:t>L</m:t>
+                      </m:r>
+                    </m:e>
+                  </m:d>
+                </m:sup>
+              </m:sSup>
+            </m:den>
+          </m:f>
+          <m:r>
+            <m:t> </m:t>
+          </m:r>
+          <m:sSup>
+            <m:e>
+              <m:r>
+                <m:t>J</m:t>
+              </m:r>
+            </m:e>
+            <m:sup>
+              <m:d>
+                <m:dPr>
+                  <m:begChr m:val="["/>
+                  <m:endChr m:val="]"/>
+                  <m:sepChr m:val=""/>
+                  <m:grow/>
+                </m:dPr>
+                <m:e>
+                  <m:r>
+                    <m:t>L</m:t>
+                  </m:r>
+                </m:e>
+              </m:d>
+            </m:sup>
+          </m:sSup>
+          <m:sSup>
+            <m:e>
+              <m:r>
+                <m:t>J</m:t>
+              </m:r>
+            </m:e>
+            <m:sup>
+              <m:d>
+                <m:dPr>
+                  <m:begChr m:val="["/>
+                  <m:endChr m:val="]"/>
+                  <m:sepChr m:val=""/>
+                  <m:grow/>
+                </m:dPr>
+                <m:e>
+                  <m:r>
+                    <m:t>L</m:t>
+                  </m:r>
+                  <m:r>
+                    <m:rPr>
+                      <m:sty m:val="p"/>
+                    </m:rPr>
+                    <m:t>−</m:t>
+                  </m:r>
+                  <m:r>
+                    <m:t>1</m:t>
+                  </m:r>
+                </m:e>
+              </m:d>
+            </m:sup>
+          </m:sSup>
+          <m:r>
+            <m:rPr>
+              <m:sty m:val="p"/>
+            </m:rPr>
+            <m:t>⋯</m:t>
+          </m:r>
+          <m:sSup>
+            <m:e>
+              <m:r>
+                <m:t>J</m:t>
+              </m:r>
+            </m:e>
+            <m:sup>
+              <m:d>
+                <m:dPr>
+                  <m:begChr m:val="["/>
+                  <m:endChr m:val="]"/>
+                  <m:sepChr m:val=""/>
+                  <m:grow/>
+                </m:dPr>
+                <m:e>
+                  <m:r>
+                    <m:t>l</m:t>
+                  </m:r>
+                  <m:r>
+                    <m:rPr>
+                      <m:sty m:val="p"/>
+                    </m:rPr>
+                    <m:t>+</m:t>
+                  </m:r>
+                  <m:r>
+                    <m:t>1</m:t>
+                  </m:r>
+                </m:e>
+              </m:d>
+            </m:sup>
+          </m:sSup>
+          <m:r>
+            <m:rPr>
+              <m:sty m:val="p"/>
+            </m:rPr>
+            <m:t>,</m:t>
+          </m:r>
+          <m:r>
+            <m:t>  </m:t>
+          </m:r>
+          <m:sSup>
+            <m:e>
+              <m:r>
+                <m:t>J</m:t>
+              </m:r>
+            </m:e>
+            <m:sup>
+              <m:d>
+                <m:dPr>
+                  <m:begChr m:val="["/>
+                  <m:endChr m:val="]"/>
+                  <m:sepChr m:val=""/>
+                  <m:grow/>
+                </m:dPr>
+                <m:e>
+                  <m:r>
+                    <m:t>i</m:t>
+                  </m:r>
+                </m:e>
+              </m:d>
+            </m:sup>
+          </m:sSup>
+          <m:r>
+            <m:rPr>
+              <m:sty m:val="p"/>
+            </m:rPr>
+            <m:t>=</m:t>
+          </m:r>
+          <m:f>
+            <m:fPr>
+              <m:type m:val="bar"/>
+            </m:fPr>
+            <m:num>
+              <m:r>
+                <m:rPr>
+                  <m:sty m:val="p"/>
+                </m:rPr>
+                <m:t>∂</m:t>
+              </m:r>
+              <m:sSup>
+                <m:e>
+                  <m:r>
+                    <m:rPr>
+                      <m:sty m:val="b"/>
+                    </m:rPr>
+                    <m:t>h</m:t>
+                  </m:r>
+                </m:e>
+                <m:sup>
+                  <m:d>
+                    <m:dPr>
+                      <m:begChr m:val="["/>
+                      <m:endChr m:val="]"/>
+                      <m:sepChr m:val=""/>
+                      <m:grow/>
+                    </m:dPr>
+                    <m:e>
+                      <m:r>
+                        <m:t>i</m:t>
+                      </m:r>
+                    </m:e>
+                  </m:d>
+                </m:sup>
+              </m:sSup>
+            </m:num>
+            <m:den>
+              <m:r>
+                <m:rPr>
+                  <m:sty m:val="p"/>
+                </m:rPr>
+                <m:t>∂</m:t>
+              </m:r>
+              <m:sSup>
+                <m:e>
+                  <m:r>
+                    <m:rPr>
+                      <m:sty m:val="b"/>
+                    </m:rPr>
+                    <m:t>z</m:t>
+                  </m:r>
+                </m:e>
+                <m:sup>
+                  <m:d>
+                    <m:dPr>
+                      <m:begChr m:val="["/>
+                      <m:endChr m:val="]"/>
+                      <m:sepChr m:val=""/>
+                      <m:grow/>
+                    </m:dPr>
+                    <m:e>
+                      <m:r>
+                        <m:t>i</m:t>
+                      </m:r>
+                    </m:e>
+                  </m:d>
+                </m:sup>
+              </m:sSup>
+            </m:den>
+          </m:f>
+          <m:r>
+            <m:t> </m:t>
+          </m:r>
+          <m:f>
+            <m:fPr>
+              <m:type m:val="bar"/>
+            </m:fPr>
+            <m:num>
+              <m:r>
+                <m:rPr>
+                  <m:sty m:val="p"/>
+                </m:rPr>
+                <m:t>∂</m:t>
+              </m:r>
+              <m:sSup>
+                <m:e>
+                  <m:r>
+                    <m:rPr>
+                      <m:sty m:val="b"/>
+                    </m:rPr>
+                    <m:t>z</m:t>
+                  </m:r>
+                </m:e>
+                <m:sup>
+                  <m:d>
+                    <m:dPr>
+                      <m:begChr m:val="["/>
+                      <m:endChr m:val="]"/>
+                      <m:sepChr m:val=""/>
+                      <m:grow/>
+                    </m:dPr>
+                    <m:e>
+                      <m:r>
+                        <m:t>i</m:t>
+                      </m:r>
+                    </m:e>
+                  </m:d>
+                </m:sup>
+              </m:sSup>
+            </m:num>
+            <m:den>
+              <m:r>
+                <m:rPr>
+                  <m:sty m:val="p"/>
+                </m:rPr>
+                <m:t>∂</m:t>
+              </m:r>
+              <m:sSup>
+                <m:e>
+                  <m:r>
+                    <m:rPr>
+                      <m:sty m:val="b"/>
+                    </m:rPr>
+                    <m:t>h</m:t>
+                  </m:r>
+                </m:e>
+                <m:sup>
+                  <m:d>
+                    <m:dPr>
+                      <m:begChr m:val="["/>
+                      <m:endChr m:val="]"/>
+                      <m:sepChr m:val=""/>
+                      <m:grow/>
+                    </m:dPr>
+                    <m:e>
+                      <m:r>
+                        <m:t>i</m:t>
+                      </m:r>
+                      <m:r>
+                        <m:rPr>
+                          <m:sty m:val="p"/>
+                        </m:rPr>
+                        <m:t>−</m:t>
+                      </m:r>
+                      <m:r>
+                        <m:t>1</m:t>
+                      </m:r>
+                    </m:e>
+                  </m:d>
+                </m:sup>
+              </m:sSup>
+            </m:den>
+          </m:f>
+          <m:r>
+            <m:rPr>
+              <m:sty m:val="p"/>
+            </m:rPr>
+            <m:t>=</m:t>
+          </m:r>
+          <m:r>
+            <m:rPr>
+              <m:sty m:val="p"/>
+            </m:rPr>
+            <m:t>diag</m:t>
+          </m:r>
+          <m:d>
+            <m:dPr>
+              <m:begChr m:val="("/>
+              <m:endChr m:val=")"/>
+              <m:sepChr m:val=""/>
+              <m:grow/>
+            </m:dPr>
+            <m:e>
+              <m:r>
+                <m:t>g</m:t>
+              </m:r>
+              <m:r>
+                <m:rPr>
+                  <m:sty m:val="p"/>
+                </m:rPr>
+                <m:t>′</m:t>
+              </m:r>
+              <m:d>
+                <m:dPr>
+                  <m:begChr m:val="("/>
+                  <m:endChr m:val=")"/>
+                  <m:sepChr m:val=""/>
+                  <m:grow/>
+                </m:dPr>
+                <m:e>
+                  <m:sSup>
+                    <m:e>
+                      <m:r>
+                        <m:rPr>
+                          <m:sty m:val="b"/>
+                        </m:rPr>
+                        <m:t>z</m:t>
+                      </m:r>
+                    </m:e>
+                    <m:sup>
+                      <m:d>
+                        <m:dPr>
+                          <m:begChr m:val="["/>
+                          <m:endChr m:val="]"/>
+                          <m:sepChr m:val=""/>
+                          <m:grow/>
+                        </m:dPr>
+                        <m:e>
+                          <m:r>
+                            <m:t>i</m:t>
+                          </m:r>
+                        </m:e>
+                      </m:d>
+                    </m:sup>
+                  </m:sSup>
+                </m:e>
+              </m:d>
+            </m:e>
+          </m:d>
+          <m:r>
+            <m:t> </m:t>
+          </m:r>
+          <m:sSup>
+            <m:e>
+              <m:r>
+                <m:t>W</m:t>
+              </m:r>
+            </m:e>
+            <m:sup>
+              <m:d>
+                <m:dPr>
+                  <m:begChr m:val="["/>
+                  <m:endChr m:val="]"/>
+                  <m:sepChr m:val=""/>
+                  <m:grow/>
+                </m:dPr>
+                <m:e>
+                  <m:r>
+                    <m:t>i</m:t>
+                  </m:r>
+                </m:e>
+              </m:d>
+            </m:sup>
+          </m:sSup>
+          <m:r>
+            <m:rPr>
+              <m:sty m:val="p"/>
+            </m:rPr>
+            <m:t>,</m:t>
+          </m:r>
+        </m:oMath>
+      </m:oMathPara>
+    </w:p>
+    <w:p>
+      <w:pPr>
+        <w:pStyle w:val="FirstParagraph"/>
+      </w:pPr>
+      <w:r>
+        <w:t xml:space="preserve">where</w:t>
       </w:r>
       <w:r>
         <w:t xml:space="preserve"> </w:t>
@@ -13625,7 +13925,7 @@
         <w:t xml:space="preserve"> </w:t>
       </w:r>
       <w:r>
-        <w:t xml:space="preserve">with</w:t>
+        <w:t xml:space="preserve">and</w:t>
       </w:r>
       <w:r>
         <w:t xml:space="preserve"> </w:t>
@@ -13751,205 +14051,38 @@
         </m:sSup>
       </m:oMath>
       <w:r>
-        <w:t xml:space="preserve"> </w:t>
-      </w:r>
-      <w:r>
-        <w:t xml:space="preserve">gives</w:t>
-      </w:r>
-      <w:r>
-        <w:t xml:space="preserve"> </w:t>
-      </w:r>
-      <m:oMath>
-        <m:sSup>
-          <m:e>
-            <m:r>
-              <m:t>J</m:t>
-            </m:r>
-          </m:e>
-          <m:sup>
-            <m:d>
-              <m:dPr>
-                <m:begChr m:val="["/>
-                <m:endChr m:val="]"/>
-                <m:sepChr m:val=""/>
-                <m:grow/>
-              </m:dPr>
-              <m:e>
-                <m:r>
-                  <m:t>i</m:t>
-                </m:r>
-              </m:e>
-            </m:d>
-          </m:sup>
-        </m:sSup>
-        <m:r>
-          <m:rPr>
-            <m:sty m:val="p"/>
-          </m:rPr>
-          <m:t>=</m:t>
-        </m:r>
-        <m:f>
-          <m:fPr>
-            <m:type m:val="bar"/>
-          </m:fPr>
-          <m:num>
-            <m:r>
-              <m:rPr>
-                <m:sty m:val="p"/>
-              </m:rPr>
-              <m:t>∂</m:t>
-            </m:r>
-            <m:sSup>
-              <m:e>
-                <m:r>
-                  <m:rPr>
-                    <m:sty m:val="b"/>
-                  </m:rPr>
-                  <m:t>h</m:t>
-                </m:r>
-              </m:e>
-              <m:sup>
-                <m:d>
-                  <m:dPr>
-                    <m:begChr m:val="["/>
-                    <m:endChr m:val="]"/>
-                    <m:sepChr m:val=""/>
-                    <m:grow/>
-                  </m:dPr>
-                  <m:e>
-                    <m:r>
-                      <m:t>i</m:t>
-                    </m:r>
-                  </m:e>
-                </m:d>
-              </m:sup>
-            </m:sSup>
-          </m:num>
-          <m:den>
-            <m:r>
-              <m:rPr>
-                <m:sty m:val="p"/>
-              </m:rPr>
-              <m:t>∂</m:t>
-            </m:r>
-            <m:sSup>
-              <m:e>
-                <m:r>
-                  <m:rPr>
-                    <m:sty m:val="b"/>
-                  </m:rPr>
-                  <m:t>z</m:t>
-                </m:r>
-              </m:e>
-              <m:sup>
-                <m:d>
-                  <m:dPr>
-                    <m:begChr m:val="["/>
-                    <m:endChr m:val="]"/>
-                    <m:sepChr m:val=""/>
-                    <m:grow/>
-                  </m:dPr>
-                  <m:e>
-                    <m:r>
-                      <m:t>i</m:t>
-                    </m:r>
-                  </m:e>
-                </m:d>
-              </m:sup>
-            </m:sSup>
-          </m:den>
-        </m:f>
-        <m:f>
-          <m:fPr>
-            <m:type m:val="bar"/>
-          </m:fPr>
-          <m:num>
-            <m:r>
-              <m:rPr>
-                <m:sty m:val="p"/>
-              </m:rPr>
-              <m:t>∂</m:t>
-            </m:r>
-            <m:sSup>
-              <m:e>
-                <m:r>
-                  <m:rPr>
-                    <m:sty m:val="b"/>
-                  </m:rPr>
-                  <m:t>z</m:t>
-                </m:r>
-              </m:e>
-              <m:sup>
-                <m:d>
-                  <m:dPr>
-                    <m:begChr m:val="["/>
-                    <m:endChr m:val="]"/>
-                    <m:sepChr m:val=""/>
-                    <m:grow/>
-                  </m:dPr>
-                  <m:e>
-                    <m:r>
-                      <m:t>i</m:t>
-                    </m:r>
-                  </m:e>
-                </m:d>
-              </m:sup>
-            </m:sSup>
-          </m:num>
-          <m:den>
-            <m:r>
-              <m:rPr>
-                <m:sty m:val="p"/>
-              </m:rPr>
-              <m:t>∂</m:t>
-            </m:r>
-            <m:sSup>
-              <m:e>
-                <m:r>
-                  <m:rPr>
-                    <m:sty m:val="b"/>
-                  </m:rPr>
-                  <m:t>h</m:t>
-                </m:r>
-              </m:e>
-              <m:sup>
-                <m:d>
-                  <m:dPr>
-                    <m:begChr m:val="["/>
-                    <m:endChr m:val="]"/>
-                    <m:sepChr m:val=""/>
-                    <m:grow/>
-                  </m:dPr>
-                  <m:e>
-                    <m:r>
-                      <m:t>i</m:t>
-                    </m:r>
-                    <m:r>
-                      <m:rPr>
-                        <m:sty m:val="p"/>
-                      </m:rPr>
-                      <m:t>−</m:t>
-                    </m:r>
-                    <m:r>
-                      <m:t>1</m:t>
-                    </m:r>
-                  </m:e>
-                </m:d>
-              </m:sup>
-            </m:sSup>
-          </m:den>
-        </m:f>
-        <m:r>
-          <m:rPr>
-            <m:sty m:val="p"/>
-          </m:rPr>
-          <m:t>=</m:t>
-        </m:r>
-        <m:r>
-          <m:rPr>
-            <m:sty m:val="p"/>
-          </m:rPr>
-          <m:t>diag</m:t>
+        <w:t xml:space="preserve">. When these factors have norm below 1, the product shrinks exponentially with depth and the early layers barely learn. RNNs have the same problem over time, because the same recurrent weight matrix enters the product once per time step.</w:t>
+      </w:r>
+    </w:p>
+    <w:p>
+      <w:pPr>
+        <w:pStyle w:val="BodyText"/>
+      </w:pPr>
+      <w:r>
+        <w:rPr>
+          <w:bCs/>
+          <w:b/>
+        </w:rPr>
+        <w:t xml:space="preserve">Which activations and why.</w:t>
+      </w:r>
+      <w:r>
+        <w:t xml:space="preserve"> </w:t>
+      </w:r>
+      <w:r>
+        <w:t xml:space="preserve">Sigmoid and tanh, because they saturate:</w:t>
+      </w:r>
+      <w:r>
+        <w:t xml:space="preserve"> </w:t>
+      </w:r>
+      <m:oMath>
+        <m:r>
+          <m:t>σ</m:t>
+        </m:r>
+        <m:r>
+          <m:rPr>
+            <m:sty m:val="p"/>
+          </m:rPr>
+          <m:t>′</m:t>
         </m:r>
         <m:d>
           <m:dPr>
@@ -13960,14 +14093,121 @@
           </m:dPr>
           <m:e>
             <m:r>
-              <m:t>g</m:t>
-            </m:r>
-            <m:r>
-              <m:rPr>
-                <m:sty m:val="p"/>
-              </m:rPr>
-              <m:t>′</m:t>
-            </m:r>
+              <m:t>x</m:t>
+            </m:r>
+          </m:e>
+        </m:d>
+        <m:r>
+          <m:rPr>
+            <m:sty m:val="p"/>
+          </m:rPr>
+          <m:t>≤</m:t>
+        </m:r>
+        <m:r>
+          <m:t>1</m:t>
+        </m:r>
+        <m:r>
+          <m:rPr>
+            <m:sty m:val="p"/>
+          </m:rPr>
+          <m:t>/</m:t>
+        </m:r>
+        <m:r>
+          <m:t>4</m:t>
+        </m:r>
+      </m:oMath>
+      <w:r>
+        <w:t xml:space="preserve"> </w:t>
+      </w:r>
+      <w:r>
+        <w:t xml:space="preserve">and</w:t>
+      </w:r>
+      <w:r>
+        <w:t xml:space="preserve"> </w:t>
+      </w:r>
+      <m:oMath>
+        <m:r>
+          <m:rPr>
+            <m:sty m:val="p"/>
+          </m:rPr>
+          <m:t>tanh</m:t>
+        </m:r>
+        <m:r>
+          <m:rPr>
+            <m:sty m:val="p"/>
+          </m:rPr>
+          <m:t>′</m:t>
+        </m:r>
+        <m:d>
+          <m:dPr>
+            <m:begChr m:val="("/>
+            <m:endChr m:val=")"/>
+            <m:sepChr m:val=""/>
+            <m:grow/>
+          </m:dPr>
+          <m:e>
+            <m:r>
+              <m:t>x</m:t>
+            </m:r>
+          </m:e>
+        </m:d>
+        <m:r>
+          <m:rPr>
+            <m:sty m:val="p"/>
+          </m:rPr>
+          <m:t>≤</m:t>
+        </m:r>
+        <m:r>
+          <m:t>1</m:t>
+        </m:r>
+      </m:oMath>
+      <w:r>
+        <w:t xml:space="preserve">, and both go to</w:t>
+      </w:r>
+      <w:r>
+        <w:t xml:space="preserve"> </w:t>
+      </w:r>
+      <m:oMath>
+        <m:r>
+          <m:t>0</m:t>
+        </m:r>
+      </m:oMath>
+      <w:r>
+        <w:t xml:space="preserve"> </w:t>
+      </w:r>
+      <w:r>
+        <w:t xml:space="preserve">as</w:t>
+      </w:r>
+      <w:r>
+        <w:t xml:space="preserve"> </w:t>
+      </w:r>
+      <m:oMath>
+        <m:d>
+          <m:dPr>
+            <m:begChr m:val="|"/>
+            <m:endChr m:val="|"/>
+            <m:sepChr m:val=""/>
+            <m:grow/>
+          </m:dPr>
+          <m:e>
+            <m:r>
+              <m:t>x</m:t>
+            </m:r>
+          </m:e>
+        </m:d>
+      </m:oMath>
+      <w:r>
+        <w:t xml:space="preserve"> </w:t>
+      </w:r>
+      <w:r>
+        <w:t xml:space="preserve">grows (3.2). Ten sigmoid layers therefore scale the gradient by at most</w:t>
+      </w:r>
+      <w:r>
+        <w:t xml:space="preserve"> </w:t>
+      </w:r>
+      <m:oMath>
+        <m:sSup>
+          <m:e>
             <m:d>
               <m:dPr>
                 <m:begChr m:val="("/>
@@ -13976,244 +14216,6 @@
                 <m:grow/>
               </m:dPr>
               <m:e>
-                <m:sSup>
-                  <m:e>
-                    <m:r>
-                      <m:rPr>
-                        <m:sty m:val="b"/>
-                      </m:rPr>
-                      <m:t>z</m:t>
-                    </m:r>
-                  </m:e>
-                  <m:sup>
-                    <m:d>
-                      <m:dPr>
-                        <m:begChr m:val="["/>
-                        <m:endChr m:val="]"/>
-                        <m:sepChr m:val=""/>
-                        <m:grow/>
-                      </m:dPr>
-                      <m:e>
-                        <m:r>
-                          <m:t>i</m:t>
-                        </m:r>
-                      </m:e>
-                    </m:d>
-                  </m:sup>
-                </m:sSup>
-              </m:e>
-            </m:d>
-          </m:e>
-        </m:d>
-        <m:sSup>
-          <m:e>
-            <m:r>
-              <m:t>W</m:t>
-            </m:r>
-          </m:e>
-          <m:sup>
-            <m:d>
-              <m:dPr>
-                <m:begChr m:val="["/>
-                <m:endChr m:val="]"/>
-                <m:sepChr m:val=""/>
-                <m:grow/>
-              </m:dPr>
-              <m:e>
-                <m:r>
-                  <m:t>i</m:t>
-                </m:r>
-              </m:e>
-            </m:d>
-          </m:sup>
-        </m:sSup>
-      </m:oMath>
-      <w:r>
-        <w:t xml:space="preserve">. When those factors have norm below 1, the product shrinks exponentially with depth, so the early layers get almost no gradient and barely learn. It hits deep feedforward networks and RNNs unrolled over long sequences, where the same recurrent weight matrix enters the product once per time step.</w:t>
-      </w:r>
-    </w:p>
-    <w:p>
-      <w:pPr>
-        <w:pStyle w:val="BodyText"/>
-      </w:pPr>
-      <w:r>
-        <w:rPr>
-          <w:bCs/>
-          <w:b/>
-        </w:rPr>
-        <w:t xml:space="preserve">Which activations and why.</w:t>
-      </w:r>
-      <w:r>
-        <w:t xml:space="preserve"> </w:t>
-      </w:r>
-      <w:r>
-        <w:t xml:space="preserve">Sigmoid and tanh are subject to it because they saturate:</w:t>
-      </w:r>
-      <w:r>
-        <w:t xml:space="preserve"> </w:t>
-      </w:r>
-      <m:oMath>
-        <m:r>
-          <m:t>σ</m:t>
-        </m:r>
-        <m:r>
-          <m:rPr>
-            <m:sty m:val="p"/>
-          </m:rPr>
-          <m:t>′</m:t>
-        </m:r>
-        <m:d>
-          <m:dPr>
-            <m:begChr m:val="("/>
-            <m:endChr m:val=")"/>
-            <m:sepChr m:val=""/>
-            <m:grow/>
-          </m:dPr>
-          <m:e>
-            <m:r>
-              <m:t>x</m:t>
-            </m:r>
-          </m:e>
-        </m:d>
-        <m:r>
-          <m:rPr>
-            <m:sty m:val="p"/>
-          </m:rPr>
-          <m:t>≤</m:t>
-        </m:r>
-        <m:r>
-          <m:t>1</m:t>
-        </m:r>
-        <m:r>
-          <m:rPr>
-            <m:sty m:val="p"/>
-          </m:rPr>
-          <m:t>/</m:t>
-        </m:r>
-        <m:r>
-          <m:t>4</m:t>
-        </m:r>
-      </m:oMath>
-      <w:r>
-        <w:t xml:space="preserve"> </w:t>
-      </w:r>
-      <w:r>
-        <w:t xml:space="preserve">and</w:t>
-      </w:r>
-      <w:r>
-        <w:t xml:space="preserve"> </w:t>
-      </w:r>
-      <m:oMath>
-        <m:r>
-          <m:rPr>
-            <m:sty m:val="p"/>
-          </m:rPr>
-          <m:t>tanh</m:t>
-        </m:r>
-        <m:r>
-          <m:rPr>
-            <m:sty m:val="p"/>
-          </m:rPr>
-          <m:t>′</m:t>
-        </m:r>
-        <m:d>
-          <m:dPr>
-            <m:begChr m:val="("/>
-            <m:endChr m:val=")"/>
-            <m:sepChr m:val=""/>
-            <m:grow/>
-          </m:dPr>
-          <m:e>
-            <m:r>
-              <m:t>x</m:t>
-            </m:r>
-          </m:e>
-        </m:d>
-        <m:r>
-          <m:rPr>
-            <m:sty m:val="p"/>
-          </m:rPr>
-          <m:t>≤</m:t>
-        </m:r>
-        <m:r>
-          <m:t>1</m:t>
-        </m:r>
-      </m:oMath>
-      <w:r>
-        <w:t xml:space="preserve">, and both derivatives go to</w:t>
-      </w:r>
-      <w:r>
-        <w:t xml:space="preserve"> </w:t>
-      </w:r>
-      <m:oMath>
-        <m:r>
-          <m:t>0</m:t>
-        </m:r>
-      </m:oMath>
-      <w:r>
-        <w:t xml:space="preserve"> </w:t>
-      </w:r>
-      <w:r>
-        <w:t xml:space="preserve">as</w:t>
-      </w:r>
-      <w:r>
-        <w:t xml:space="preserve"> </w:t>
-      </w:r>
-      <m:oMath>
-        <m:d>
-          <m:dPr>
-            <m:begChr m:val="|"/>
-            <m:endChr m:val="|"/>
-            <m:sepChr m:val=""/>
-            <m:grow/>
-          </m:dPr>
-          <m:e>
-            <m:r>
-              <m:t>x</m:t>
-            </m:r>
-          </m:e>
-        </m:d>
-      </m:oMath>
-      <w:r>
-        <w:t xml:space="preserve"> </w:t>
-      </w:r>
-      <w:r>
-        <w:t xml:space="preserve">grows (3.2). With sigmoid each layer multiplies the gradient by at most</w:t>
-      </w:r>
-      <w:r>
-        <w:t xml:space="preserve"> </w:t>
-      </w:r>
-      <m:oMath>
-        <m:r>
-          <m:t>1</m:t>
-        </m:r>
-        <m:r>
-          <m:rPr>
-            <m:sty m:val="p"/>
-          </m:rPr>
-          <m:t>/</m:t>
-        </m:r>
-        <m:r>
-          <m:t>4</m:t>
-        </m:r>
-      </m:oMath>
-      <w:r>
-        <w:t xml:space="preserve">, so ten layers scale it by at most</w:t>
-      </w:r>
-      <w:r>
-        <w:t xml:space="preserve"> </w:t>
-      </w:r>
-      <m:oMath>
-        <m:sSup>
-          <m:e>
-            <m:d>
-              <m:dPr>
-                <m:begChr m:val="("/>
-                <m:endChr m:val=")"/>
-                <m:sepChr m:val=""/>
-                <m:grow/>
-              </m:dPr>
-              <m:e>
                 <m:r>
                   <m:t>1</m:t>
                 </m:r>
@@ -14270,10 +14272,7 @@
         </m:sSup>
       </m:oMath>
       <w:r>
-        <w:t xml:space="preserve"> </w:t>
-      </w:r>
-      <w:r>
-        <w:t xml:space="preserve">before the weights are even counted. ReLU’s derivative is</w:t>
+        <w:t xml:space="preserve">, before the weights are even counted. ReLU’s derivative is</w:t>
       </w:r>
       <w:r>
         <w:t xml:space="preserve"> </w:t>
@@ -14287,7 +14286,7 @@
         <w:t xml:space="preserve"> </w:t>
       </w:r>
       <w:r>
-        <w:t xml:space="preserve">for every positive input, so it does not shrink the gradient through active units (inactive units pass back a zero gradient, which is the separate</w:t>
+        <w:t xml:space="preserve">for every positive input, so it does not shrink the gradient through active units (inactive units pass back zero, which is the separate</w:t>
       </w:r>
       <w:r>
         <w:t xml:space="preserve"> </w:t>
@@ -14740,7 +14739,7 @@
         <w:t xml:space="preserve">Efficient BackProp</w:t>
       </w:r>
       <w:r>
-        <w:t xml:space="preserve">) recommend zero-mean inputs to every layer for these reasons, and batch and layer normalization re-center activations for the same reason.</w:t>
+        <w:t xml:space="preserve">) recommend inputs with zero mean, and the same argument applies to every layer, because each layer’s inputs are the previous layer’s outputs. Batch and layer normalization re-center activations for the same reason.</w:t>
       </w:r>
     </w:p>
     <w:bookmarkEnd w:id="45"/>
@@ -29563,11 +29562,12 @@
         <w:jc w:val="start"/>
       </w:tblPr>
       <w:tblGrid>
-        <w:gridCol w:w="1584"/>
-        <w:gridCol w:w="1584"/>
-        <w:gridCol w:w="1584"/>
-        <w:gridCol w:w="1584"/>
-        <w:gridCol w:w="1584"/>
+        <w:gridCol w:w="1320"/>
+        <w:gridCol w:w="1320"/>
+        <w:gridCol w:w="1320"/>
+        <w:gridCol w:w="1320"/>
+        <w:gridCol w:w="1320"/>
+        <w:gridCol w:w="1320"/>
       </w:tblGrid>
       <w:tr>
         <w:trPr>
@@ -29605,7 +29605,19 @@
               <w:jc w:val="center"/>
             </w:pPr>
             <w:r>
-              <w:t xml:space="preserve">Best dev accuracy</w:t>
+              <w:t xml:space="preserve">Dev acc. after epoch 0</w:t>
+            </w:r>
+          </w:p>
+        </w:tc>
+        <w:tc>
+          <w:tcPr/>
+          <w:p>
+            <w:pPr>
+              <w:pStyle w:val="Compact"/>
+              <w:jc w:val="center"/>
+            </w:pPr>
+            <w:r>
+              <w:t xml:space="preserve">Best dev acc.</w:t>
             </w:r>
           </w:p>
         </w:tc>
@@ -29629,7 +29641,7 @@
               <w:jc w:val="center"/>
             </w:pPr>
             <w:r>
-              <w:t xml:space="preserve">Test accuracy</w:t>
+              <w:t xml:space="preserve">Test acc.</w:t>
             </w:r>
           </w:p>
         </w:tc>
@@ -29656,6 +29668,18 @@
             </w:pPr>
             <w:r>
               <w:t xml:space="preserve">0.025</w:t>
+            </w:r>
+          </w:p>
+        </w:tc>
+        <w:tc>
+          <w:tcPr/>
+          <w:p>
+            <w:pPr>
+              <w:pStyle w:val="Compact"/>
+              <w:jc w:val="center"/>
+            </w:pPr>
+            <w:r>
+              <w:t xml:space="preserve">0.744</w:t>
             </w:r>
           </w:p>
         </w:tc>
@@ -29729,6 +29753,18 @@
               <w:jc w:val="center"/>
             </w:pPr>
             <w:r>
+              <w:t xml:space="preserve">0.743</w:t>
+            </w:r>
+          </w:p>
+        </w:tc>
+        <w:tc>
+          <w:tcPr/>
+          <w:p>
+            <w:pPr>
+              <w:pStyle w:val="Compact"/>
+              <w:jc w:val="center"/>
+            </w:pPr>
+            <w:r>
               <w:t xml:space="preserve">0.779</w:t>
             </w:r>
           </w:p>
@@ -29797,6 +29833,18 @@
             </w:pPr>
             <w:r>
               <w:t xml:space="preserve">0.01</w:t>
+            </w:r>
+          </w:p>
+        </w:tc>
+        <w:tc>
+          <w:tcPr/>
+          <w:p>
+            <w:pPr>
+              <w:pStyle w:val="Compact"/>
+              <w:jc w:val="center"/>
+            </w:pPr>
+            <w:r>
+              <w:t xml:space="preserve">0.709</w:t>
             </w:r>
           </w:p>
         </w:tc>
@@ -29904,6 +29952,18 @@
               <w:jc w:val="center"/>
             </w:pPr>
             <w:r>
+              <w:t xml:space="preserve">0.686</w:t>
+            </w:r>
+          </w:p>
+        </w:tc>
+        <w:tc>
+          <w:tcPr/>
+          <w:p>
+            <w:pPr>
+              <w:pStyle w:val="Compact"/>
+              <w:jc w:val="center"/>
+            </w:pPr>
+            <w:r>
               <w:t xml:space="preserve">0.767</w:t>
             </w:r>
           </w:p>
@@ -30414,24 +30474,13 @@
         <w:t xml:space="preserve"> </w:t>
       </w:r>
       <w:r>
-        <w:t xml:space="preserve">In all four configurations the train loss keeps falling while the dev loss drops for a few epochs and then flattens between about 0.47 and 0.49, and the final train and dev losses differ by only 0.01 to 0.03, so the models are limited by their input features more than by overfitting. Deeper is not better here: best dev accuracy is 77.1%, 77.9%, 77.7%, and 76.7% for zero to three hidden layers, all within about one standard error of each other, and the three-layer network (which the template also trains at the smallest learning rate, 0.001) starts at chance (epoch-0 train loss 0.695, about</w:t>
-      </w:r>
-      <w:r>
-        <w:t xml:space="preserve"> </w:t>
-      </w:r>
-      <m:oMath>
-        <m:r>
-          <m:rPr>
-            <m:sty m:val="p"/>
-          </m:rPr>
-          <m:t>ln</m:t>
-        </m:r>
-        <m:r>
-          <m:t>2</m:t>
-        </m:r>
-      </m:oMath>
-      <w:r>
-        <w:t xml:space="preserve">) and has the noisiest dev curve. An average of 50-dimensional word vectors discards word order and negation, so a linear classifier already gets most of what the feature holds, and extra layers add parameters to optimize without adding information the classifier can use.</w:t>
+        <w:t xml:space="preserve">Train loss keeps falling in every configuration while dev loss levels off at 0.47 to 0.49, and the two deeper networks start lower (table) and have bumpier dev curves. Deeper is not better: best dev accuracy is 77.1%, 77.9%, 77.7%, and 76.7% for zero to three hidden layers, a spread smaller than the noise of a 1</w:t>
+      </w:r>
+      <w:r>
+        <w:t xml:space="preserve">,</w:t>
+      </w:r>
+      <w:r>
+        <w:t xml:space="preserve">000-review dev set. Depth and learning rate change together in this template, so the run cannot separate them, but a likely reason for the flat result is that averaged word vectors discard word order and negation, which leaves extra layers little more information to use.</w:t>
       </w:r>
     </w:p>
     <w:bookmarkEnd w:id="81"/>
@@ -31159,13 +31208,56 @@
         <w:t xml:space="preserve"> </w:t>
       </w:r>
       <w:r>
-        <w:t xml:space="preserve">All five activations end in the same place, with best dev accuracy between 77.4% and 78.7% and minimum dev loss between 0.464 and 0.477, differences that sit inside the noise of a 1</w:t>
-      </w:r>
-      <w:r>
-        <w:t xml:space="preserve">,</w:t>
-      </w:r>
-      <w:r>
-        <w:t xml:space="preserve">000-review dev set. The visible difference is at the start: sigmoid begins at chance (epoch-0 train loss 0.695) while ReLU, GELU, and LeakyReLU begin at 0.57 to 0.60, which fits Sections 3.3 and 3.4 (sigmoid’s slope is at most 1/4 and its output is not zero-centered), but with a single hidden layer the handicap does not compound and it is gone within a few epochs. From epoch 5 to epoch 19, each activation’s dev loss wanders over a band 0.05 to 0.10 wide (tanh from 0.473 to 0.571) while its train loss moves within a band 0.015 to 0.034 wide, so for this feature set which checkpoint is kept matters more than which activation is used.</w:t>
+        <w:t xml:space="preserve">All five activations end in the same place, with best dev accuracy between 77.4% and 78.7% and minimum dev loss between 0.464 and 0.477, differences inside the dev set’s noise. Sigmoid starts slowest (average epoch-0 train loss 0.695, about</w:t>
+      </w:r>
+      <w:r>
+        <w:t xml:space="preserve"> </w:t>
+      </w:r>
+      <m:oMath>
+        <m:r>
+          <m:rPr>
+            <m:sty m:val="p"/>
+          </m:rPr>
+          <m:t>ln</m:t>
+        </m:r>
+        <m:r>
+          <m:t>2</m:t>
+        </m:r>
+      </m:oMath>
+      <w:r>
+        <w:t xml:space="preserve">, against 0.57 to 0.62 for the others), consistent with its smaller slope (</w:t>
+      </w:r>
+      <m:oMath>
+        <m:r>
+          <m:t>σ</m:t>
+        </m:r>
+        <m:r>
+          <m:rPr>
+            <m:sty m:val="p"/>
+          </m:rPr>
+          <m:t>′</m:t>
+        </m:r>
+        <m:r>
+          <m:rPr>
+            <m:sty m:val="p"/>
+          </m:rPr>
+          <m:t>≤</m:t>
+        </m:r>
+        <m:r>
+          <m:t>1</m:t>
+        </m:r>
+        <m:r>
+          <m:rPr>
+            <m:sty m:val="p"/>
+          </m:rPr>
+          <m:t>/</m:t>
+        </m:r>
+        <m:r>
+          <m:t>4</m:t>
+        </m:r>
+      </m:oMath>
+      <w:r>
+        <w:t xml:space="preserve">) and its outputs not being zero-centered (Section 3.4), but all five reach 74% to 75% dev accuracy by the end of epoch 0. From epoch 5 on, each activation’s dev loss moves within a band up to 0.10 wide (tanh), wider than any gap between activations, so keeping the best-dev checkpoint matters more than the choice of activation.</w:t>
       </w:r>
     </w:p>
     <w:bookmarkEnd w:id="88"/>
@@ -31192,7 +31284,22 @@
         <w:t xml:space="preserve"> </w:t>
       </w:r>
       <w:r>
-        <w:t xml:space="preserve">trains the same single 512-unit sigmoid MLP (batch size 64, 20 epochs) at five learning rates: the provided 0.02 plus 0.1, 0.002, 0.0002, and 0.00002, spaced on a log scale from 0.1 down to 0.00002.</w:t>
+        <w:t xml:space="preserve">trains the same single 512-unit sigmoid MLP (batch size 64, 20 epochs) at five learning rates: the provided 0.02 plus 0.1, 0.002, 0.0002, and 0.00002 (a factor of 5 above the default, then factors of 10 below it). A separate two-epoch check (</w:t>
+      </w:r>
+      <w:r>
+        <w:rPr>
+          <w:rStyle w:val="VerbatimChar"/>
+        </w:rPr>
+        <w:t xml:space="preserve">verification/</w:t>
+      </w:r>
+      <w:r>
+        <w:rPr>
+          <w:rStyle w:val="VerbatimChar"/>
+        </w:rPr>
+        <w:t xml:space="preserve">check_lr_saturation.py</w:t>
+      </w:r>
+      <w:r>
+        <w:t xml:space="preserve">) counts how many hidden sigmoid outputs on the dev set are below 0.01 or above 0.99 at learning rates 0.1 and 0.02. It is a separate, seeded run, so its timing differs from the plotted one.</w:t>
       </w:r>
     </w:p>
     <w:tbl>
@@ -31585,6 +31692,274 @@
         </w:tc>
       </w:tr>
     </w:tbl>
+    <w:p/>
+    <w:tbl>
+      <w:tblPr>
+        <w:tblStyle w:val="Table"/>
+        <w:tblW w:type="auto" w:w="0"/>
+        <w:tblLook w:firstRow="1" w:lastRow="0" w:firstColumn="0" w:lastColumn="0" w:noHBand="0" w:noVBand="0" w:val="0020"/>
+        <w:jc w:val="start"/>
+      </w:tblPr>
+      <w:tblGrid>
+        <w:gridCol w:w="1980"/>
+        <w:gridCol w:w="1980"/>
+        <w:gridCol w:w="1980"/>
+        <w:gridCol w:w="1980"/>
+      </w:tblGrid>
+      <w:tr>
+        <w:trPr>
+          <w:tblHeader w:val="true"/>
+        </w:trPr>
+        <w:tc>
+          <w:tcPr/>
+          <w:p>
+            <w:pPr>
+              <w:pStyle w:val="Compact"/>
+              <w:jc w:val="left"/>
+            </w:pPr>
+            <w:r>
+              <w:t xml:space="preserve">Saturation check</w:t>
+            </w:r>
+          </w:p>
+        </w:tc>
+        <w:tc>
+          <w:tcPr/>
+          <w:p>
+            <w:pPr>
+              <w:pStyle w:val="Compact"/>
+              <w:jc w:val="center"/>
+            </w:pPr>
+            <w:r>
+              <w:t xml:space="preserve">Epoch</w:t>
+            </w:r>
+          </w:p>
+        </w:tc>
+        <w:tc>
+          <w:tcPr/>
+          <w:p>
+            <w:pPr>
+              <w:pStyle w:val="Compact"/>
+              <w:jc w:val="center"/>
+            </w:pPr>
+            <w:r>
+              <w:t xml:space="preserve">Hidden sigmoid outputs saturated</w:t>
+            </w:r>
+          </w:p>
+        </w:tc>
+        <w:tc>
+          <w:tcPr/>
+          <w:p>
+            <w:pPr>
+              <w:pStyle w:val="Compact"/>
+              <w:jc w:val="center"/>
+            </w:pPr>
+            <w:r>
+              <w:t xml:space="preserve">Dev accuracy</w:t>
+            </w:r>
+          </w:p>
+        </w:tc>
+      </w:tr>
+      <w:tr>
+        <w:tc>
+          <w:tcPr/>
+          <w:p>
+            <w:pPr>
+              <w:pStyle w:val="Compact"/>
+              <w:jc w:val="left"/>
+            </w:pPr>
+            <w:r>
+              <w:t xml:space="preserve">lr 0.1</w:t>
+            </w:r>
+          </w:p>
+        </w:tc>
+        <w:tc>
+          <w:tcPr/>
+          <w:p>
+            <w:pPr>
+              <w:pStyle w:val="Compact"/>
+              <w:jc w:val="center"/>
+            </w:pPr>
+            <w:r>
+              <w:t xml:space="preserve">0</w:t>
+            </w:r>
+          </w:p>
+        </w:tc>
+        <w:tc>
+          <w:tcPr/>
+          <w:p>
+            <w:pPr>
+              <w:pStyle w:val="Compact"/>
+              <w:jc w:val="center"/>
+            </w:pPr>
+            <w:r>
+              <w:t xml:space="preserve">100%</w:t>
+            </w:r>
+          </w:p>
+        </w:tc>
+        <w:tc>
+          <w:tcPr/>
+          <w:p>
+            <w:pPr>
+              <w:pStyle w:val="Compact"/>
+              <w:jc w:val="center"/>
+            </w:pPr>
+            <w:r>
+              <w:t xml:space="preserve">0.488</w:t>
+            </w:r>
+          </w:p>
+        </w:tc>
+      </w:tr>
+      <w:tr>
+        <w:tc>
+          <w:tcPr/>
+          <w:p>
+            <w:pPr>
+              <w:pStyle w:val="Compact"/>
+              <w:jc w:val="left"/>
+            </w:pPr>
+            <w:r>
+              <w:t xml:space="preserve">lr 0.1</w:t>
+            </w:r>
+          </w:p>
+        </w:tc>
+        <w:tc>
+          <w:tcPr/>
+          <w:p>
+            <w:pPr>
+              <w:pStyle w:val="Compact"/>
+              <w:jc w:val="center"/>
+            </w:pPr>
+            <w:r>
+              <w:t xml:space="preserve">1</w:t>
+            </w:r>
+          </w:p>
+        </w:tc>
+        <w:tc>
+          <w:tcPr/>
+          <w:p>
+            <w:pPr>
+              <w:pStyle w:val="Compact"/>
+              <w:jc w:val="center"/>
+            </w:pPr>
+            <w:r>
+              <w:t xml:space="preserve">99.8%</w:t>
+            </w:r>
+          </w:p>
+        </w:tc>
+        <w:tc>
+          <w:tcPr/>
+          <w:p>
+            <w:pPr>
+              <w:pStyle w:val="Compact"/>
+              <w:jc w:val="center"/>
+            </w:pPr>
+            <w:r>
+              <w:t xml:space="preserve">0.738</w:t>
+            </w:r>
+          </w:p>
+        </w:tc>
+      </w:tr>
+      <w:tr>
+        <w:tc>
+          <w:tcPr/>
+          <w:p>
+            <w:pPr>
+              <w:pStyle w:val="Compact"/>
+              <w:jc w:val="left"/>
+            </w:pPr>
+            <w:r>
+              <w:t xml:space="preserve">lr 0.02</w:t>
+            </w:r>
+          </w:p>
+        </w:tc>
+        <w:tc>
+          <w:tcPr/>
+          <w:p>
+            <w:pPr>
+              <w:pStyle w:val="Compact"/>
+              <w:jc w:val="center"/>
+            </w:pPr>
+            <w:r>
+              <w:t xml:space="preserve">0</w:t>
+            </w:r>
+          </w:p>
+        </w:tc>
+        <w:tc>
+          <w:tcPr/>
+          <w:p>
+            <w:pPr>
+              <w:pStyle w:val="Compact"/>
+              <w:jc w:val="center"/>
+            </w:pPr>
+            <w:r>
+              <w:t xml:space="preserve">0%</w:t>
+            </w:r>
+          </w:p>
+        </w:tc>
+        <w:tc>
+          <w:tcPr/>
+          <w:p>
+            <w:pPr>
+              <w:pStyle w:val="Compact"/>
+              <w:jc w:val="center"/>
+            </w:pPr>
+            <w:r>
+              <w:t xml:space="preserve">0.750</w:t>
+            </w:r>
+          </w:p>
+        </w:tc>
+      </w:tr>
+      <w:tr>
+        <w:tc>
+          <w:tcPr/>
+          <w:p>
+            <w:pPr>
+              <w:pStyle w:val="Compact"/>
+              <w:jc w:val="left"/>
+            </w:pPr>
+            <w:r>
+              <w:t xml:space="preserve">lr 0.02</w:t>
+            </w:r>
+          </w:p>
+        </w:tc>
+        <w:tc>
+          <w:tcPr/>
+          <w:p>
+            <w:pPr>
+              <w:pStyle w:val="Compact"/>
+              <w:jc w:val="center"/>
+            </w:pPr>
+            <w:r>
+              <w:t xml:space="preserve">1</w:t>
+            </w:r>
+          </w:p>
+        </w:tc>
+        <w:tc>
+          <w:tcPr/>
+          <w:p>
+            <w:pPr>
+              <w:pStyle w:val="Compact"/>
+              <w:jc w:val="center"/>
+            </w:pPr>
+            <w:r>
+              <w:t xml:space="preserve">0.6%</w:t>
+            </w:r>
+          </w:p>
+        </w:tc>
+        <w:tc>
+          <w:tcPr/>
+          <w:p>
+            <w:pPr>
+              <w:pStyle w:val="Compact"/>
+              <w:jc w:val="center"/>
+            </w:pPr>
+            <w:r>
+              <w:t xml:space="preserve">0.758</w:t>
+            </w:r>
+          </w:p>
+        </w:tc>
+      </w:tr>
+    </w:tbl>
     <w:p>
       <w:pPr>
         <w:pStyle w:val="BodyText"/>
@@ -31730,16 +32105,7 @@
         <w:t xml:space="preserve"> </w:t>
       </w:r>
       <w:r>
-        <w:t xml:space="preserve">Learning rates from 0.002 to 0.02 work about equally well (best dev accuracy 76.9% and 78.0%), and the provided 0.02 gets to a good model fastest. At 0.1 the network sits at chance for the first five epochs (dev loss 0.693, accuracy near 50%) and stays noisy after it escapes, while at 0.0002 the loss falls smoothly and slowly to a worse end point (dev loss 0.499, 75.0%) and at 0.00002 it has barely moved (dev loss 0.690 to 0.646, 69.4%), so the two ends fail in opposite ways, one by overshooting and one by running out of epochs. The chance-level start at 0.1 coincides with sigmoid saturation: in a separate two-epoch check (</w:t>
-      </w:r>
-      <w:r>
-        <w:rPr>
-          <w:rStyle w:val="VerbatimChar"/>
-        </w:rPr>
-        <w:t xml:space="preserve">verification/check_lr_saturation.py</w:t>
-      </w:r>
-      <w:r>
-        <w:t xml:space="preserve">), 100% of the hidden sigmoid outputs on the dev set were below 0.01 or above 0.99 after the first epoch at 0.1 (dev accuracy 48.8%) against 0% at 0.02 (75.0%), and at 0.1 accuracy recovered to 73.8% in the next epoch with 99.8% still saturated, so the saturated units act like near-binary switches whose small gradients (Section 1.7) slow the start rather than block learning.</w:t>
+        <w:t xml:space="preserve">Learning rates from 0.002 to 0.02 work about equally well (best dev accuracy 76.9% and 78.0%), and the provided 0.02 gets there fastest. At the extremes, 0.1 sits at chance for the first five epochs and still reaches 77.2% at its best, while 0.0002 and 0.00002 improve smoothly but too slowly for 20 epochs and finish at 75.0% and 69.2%. The saturation check shows the large steps at 0.1 saturating every hidden sigmoid within one epoch, but accuracy recovered while they stayed saturated, so saturation explains the slow start only in part.</w:t>
       </w:r>
     </w:p>
     <w:bookmarkEnd w:id="95"/>

</xml_diff>

<commit_message>
HW3: notation line, 3.3 definitions inside the equation, numbered sections in the Word copy
Co-Authored-By: Claude Opus 5.5 <noreply@anthropic.com>
Claude-Session: https://claude.ai/code/session_01WbwbakQfUu5w66XipVgCSJ
</commit_message>
<xml_diff>
--- a/Onieal_HW3.docx
+++ b/Onieal_HW3.docx
@@ -298,11 +298,87 @@
         <w:t xml:space="preserve">file.</w:t>
       </w:r>
     </w:p>
+    <w:p>
+      <w:pPr>
+        <w:pStyle w:val="FirstParagraph"/>
+      </w:pPr>
+      <w:r>
+        <w:rPr>
+          <w:bCs/>
+          <w:b/>
+        </w:rPr>
+        <w:t xml:space="preserve">Notation.</w:t>
+      </w:r>
+      <w:r>
+        <w:t xml:space="preserve"> </w:t>
+      </w:r>
+      <w:r>
+        <w:t xml:space="preserve">Throughout,</w:t>
+      </w:r>
+      <w:r>
+        <w:t xml:space="preserve"> </w:t>
+      </w:r>
+      <m:oMath>
+        <m:r>
+          <m:rPr>
+            <m:sty m:val="p"/>
+          </m:rPr>
+          <m:t>ℓ</m:t>
+        </m:r>
+      </m:oMath>
+      <w:r>
+        <w:t xml:space="preserve"> </w:t>
+      </w:r>
+      <w:r>
+        <w:t xml:space="preserve">is the loss on one training example,</w:t>
+      </w:r>
+      <w:r>
+        <w:t xml:space="preserve"> </w:t>
+      </w:r>
+      <m:oMath>
+        <m:r>
+          <m:rPr>
+            <m:sty m:val="p"/>
+            <m:scr m:val="script"/>
+          </m:rPr>
+          <m:t>L</m:t>
+        </m:r>
+      </m:oMath>
+      <w:r>
+        <w:t xml:space="preserve"> </w:t>
+      </w:r>
+      <w:r>
+        <w:t xml:space="preserve">is the loss being minimized (one example’s or a batch’s), and</w:t>
+      </w:r>
+      <w:r>
+        <w:t xml:space="preserve"> </w:t>
+      </w:r>
+      <m:oMath>
+        <m:r>
+          <m:t>L</m:t>
+        </m:r>
+      </m:oMath>
+      <w:r>
+        <w:t xml:space="preserve"> </w:t>
+      </w:r>
+      <w:r>
+        <w:t xml:space="preserve">is the number of layers.</w:t>
+      </w:r>
+    </w:p>
     <w:bookmarkStart w:id="30" w:name="concepts-intuitions-and-big-picture"/>
     <w:p>
       <w:pPr>
         <w:pStyle w:val="Heading1"/>
       </w:pPr>
+      <w:r>
+        <w:rPr>
+          <w:rStyle w:val="SectionNumber"/>
+        </w:rPr>
+        <w:t xml:space="preserve">1</w:t>
+      </w:r>
+      <w:r>
+        <w:tab/>
+      </w:r>
       <w:r>
         <w:t xml:space="preserve">Concepts, intuitions and big picture</w:t>
       </w:r>
@@ -769,6 +845,10 @@
                       <m:t>∂</m:t>
                     </m:r>
                     <m:r>
+                      <m:rPr>
+                        <m:sty m:val="p"/>
+                        <m:scr m:val="script"/>
+                      </m:rPr>
                       <m:t>L</m:t>
                     </m:r>
                   </m:num>
@@ -944,6 +1024,10 @@
                       <m:t>∂</m:t>
                     </m:r>
                     <m:r>
+                      <m:rPr>
+                        <m:sty m:val="p"/>
+                        <m:scr m:val="script"/>
+                      </m:rPr>
                       <m:t>L</m:t>
                     </m:r>
                   </m:num>
@@ -1031,6 +1115,10 @@
                       <m:t>∂</m:t>
                     </m:r>
                     <m:r>
+                      <m:rPr>
+                        <m:sty m:val="p"/>
+                        <m:scr m:val="script"/>
+                      </m:rPr>
                       <m:t>L</m:t>
                     </m:r>
                   </m:num>
@@ -3476,6 +3564,10 @@
           <m:t>∂</m:t>
         </m:r>
         <m:r>
+          <m:rPr>
+            <m:sty m:val="p"/>
+            <m:scr m:val="script"/>
+          </m:rPr>
           <m:t>L</m:t>
         </m:r>
         <m:r>
@@ -6338,6 +6430,15 @@
         <w:pStyle w:val="Heading1"/>
       </w:pPr>
       <w:r>
+        <w:rPr>
+          <w:rStyle w:val="SectionNumber"/>
+        </w:rPr>
+        <w:t xml:space="preserve">2</w:t>
+      </w:r>
+      <w:r>
+        <w:tab/>
+      </w:r>
+      <w:r>
         <w:t xml:space="preserve">Revisiting Jacobians</w:t>
       </w:r>
     </w:p>
@@ -10759,6 +10860,15 @@
       <w:pPr>
         <w:pStyle w:val="Heading1"/>
       </w:pPr>
+      <w:r>
+        <w:rPr>
+          <w:rStyle w:val="SectionNumber"/>
+        </w:rPr>
+        <w:t xml:space="preserve">3</w:t>
+      </w:r>
+      <w:r>
+        <w:tab/>
+      </w:r>
       <w:r>
         <w:t xml:space="preserve">Activations Per Layer, Keeps Linearity Away!</w:t>
       </w:r>
@@ -13344,499 +13454,724 @@
           <m:jc m:val="center"/>
         </m:oMathParaPr>
         <m:oMath>
-          <m:f>
-            <m:fPr>
-              <m:type m:val="bar"/>
-            </m:fPr>
-            <m:num>
-              <m:r>
-                <m:rPr>
-                  <m:sty m:val="p"/>
-                </m:rPr>
-                <m:t>∂</m:t>
-              </m:r>
-              <m:r>
-                <m:rPr>
-                  <m:sty m:val="p"/>
-                  <m:scr m:val="script"/>
-                </m:rPr>
-                <m:t>L</m:t>
-              </m:r>
-            </m:num>
-            <m:den>
-              <m:r>
-                <m:rPr>
-                  <m:sty m:val="p"/>
-                </m:rPr>
-                <m:t>∂</m:t>
-              </m:r>
-              <m:sSup>
-                <m:e>
-                  <m:r>
-                    <m:rPr>
-                      <m:sty m:val="b"/>
-                    </m:rPr>
-                    <m:t>h</m:t>
-                  </m:r>
-                </m:e>
-                <m:sup>
-                  <m:d>
-                    <m:dPr>
-                      <m:begChr m:val="["/>
-                      <m:endChr m:val="]"/>
-                      <m:sepChr m:val=""/>
-                      <m:grow/>
-                    </m:dPr>
-                    <m:e>
-                      <m:r>
-                        <m:t>l</m:t>
-                      </m:r>
-                    </m:e>
-                  </m:d>
-                </m:sup>
-              </m:sSup>
-            </m:den>
-          </m:f>
-          <m:r>
-            <m:rPr>
-              <m:sty m:val="p"/>
-            </m:rPr>
-            <m:t>=</m:t>
-          </m:r>
-          <m:f>
-            <m:fPr>
-              <m:type m:val="bar"/>
-            </m:fPr>
-            <m:num>
-              <m:r>
-                <m:rPr>
-                  <m:sty m:val="p"/>
-                </m:rPr>
-                <m:t>∂</m:t>
-              </m:r>
-              <m:r>
-                <m:rPr>
-                  <m:sty m:val="p"/>
-                  <m:scr m:val="script"/>
-                </m:rPr>
-                <m:t>L</m:t>
-              </m:r>
-            </m:num>
-            <m:den>
-              <m:r>
-                <m:rPr>
-                  <m:sty m:val="p"/>
-                </m:rPr>
-                <m:t>∂</m:t>
-              </m:r>
-              <m:sSup>
-                <m:e>
-                  <m:r>
-                    <m:rPr>
-                      <m:sty m:val="b"/>
-                    </m:rPr>
-                    <m:t>h</m:t>
-                  </m:r>
-                </m:e>
-                <m:sup>
-                  <m:d>
-                    <m:dPr>
-                      <m:begChr m:val="["/>
-                      <m:endChr m:val="]"/>
-                      <m:sepChr m:val=""/>
-                      <m:grow/>
-                    </m:dPr>
-                    <m:e>
-                      <m:r>
-                        <m:t>L</m:t>
-                      </m:r>
-                    </m:e>
-                  </m:d>
-                </m:sup>
-              </m:sSup>
-            </m:den>
-          </m:f>
-          <m:r>
-            <m:t> </m:t>
-          </m:r>
-          <m:sSup>
-            <m:e>
-              <m:r>
-                <m:t>J</m:t>
-              </m:r>
-            </m:e>
-            <m:sup>
-              <m:d>
-                <m:dPr>
-                  <m:begChr m:val="["/>
-                  <m:endChr m:val="]"/>
-                  <m:sepChr m:val=""/>
-                  <m:grow/>
-                </m:dPr>
-                <m:e>
-                  <m:r>
-                    <m:t>L</m:t>
-                  </m:r>
-                </m:e>
-              </m:d>
-            </m:sup>
-          </m:sSup>
-          <m:sSup>
-            <m:e>
-              <m:r>
-                <m:t>J</m:t>
-              </m:r>
-            </m:e>
-            <m:sup>
-              <m:d>
-                <m:dPr>
-                  <m:begChr m:val="["/>
-                  <m:endChr m:val="]"/>
-                  <m:sepChr m:val=""/>
-                  <m:grow/>
-                </m:dPr>
-                <m:e>
-                  <m:r>
-                    <m:t>L</m:t>
-                  </m:r>
-                  <m:r>
-                    <m:rPr>
-                      <m:sty m:val="p"/>
-                    </m:rPr>
-                    <m:t>−</m:t>
-                  </m:r>
-                  <m:r>
-                    <m:t>1</m:t>
-                  </m:r>
-                </m:e>
-              </m:d>
-            </m:sup>
-          </m:sSup>
-          <m:r>
-            <m:rPr>
-              <m:sty m:val="p"/>
-            </m:rPr>
-            <m:t>⋯</m:t>
-          </m:r>
-          <m:sSup>
-            <m:e>
-              <m:r>
-                <m:t>J</m:t>
-              </m:r>
-            </m:e>
-            <m:sup>
-              <m:d>
-                <m:dPr>
-                  <m:begChr m:val="["/>
-                  <m:endChr m:val="]"/>
-                  <m:sepChr m:val=""/>
-                  <m:grow/>
-                </m:dPr>
-                <m:e>
-                  <m:r>
-                    <m:t>l</m:t>
-                  </m:r>
-                  <m:r>
-                    <m:rPr>
-                      <m:sty m:val="p"/>
-                    </m:rPr>
-                    <m:t>+</m:t>
-                  </m:r>
-                  <m:r>
-                    <m:t>1</m:t>
-                  </m:r>
-                </m:e>
-              </m:d>
-            </m:sup>
-          </m:sSup>
-          <m:r>
-            <m:rPr>
-              <m:sty m:val="p"/>
-            </m:rPr>
-            <m:t>,</m:t>
-          </m:r>
-          <m:r>
-            <m:t>  </m:t>
-          </m:r>
-          <m:sSup>
-            <m:e>
-              <m:r>
-                <m:t>J</m:t>
-              </m:r>
-            </m:e>
-            <m:sup>
-              <m:d>
-                <m:dPr>
-                  <m:begChr m:val="["/>
-                  <m:endChr m:val="]"/>
-                  <m:sepChr m:val=""/>
-                  <m:grow/>
-                </m:dPr>
-                <m:e>
-                  <m:r>
-                    <m:t>i</m:t>
-                  </m:r>
-                </m:e>
-              </m:d>
-            </m:sup>
-          </m:sSup>
-          <m:r>
-            <m:rPr>
-              <m:sty m:val="p"/>
-            </m:rPr>
-            <m:t>=</m:t>
-          </m:r>
-          <m:f>
-            <m:fPr>
-              <m:type m:val="bar"/>
-            </m:fPr>
-            <m:num>
-              <m:r>
-                <m:rPr>
-                  <m:sty m:val="p"/>
-                </m:rPr>
-                <m:t>∂</m:t>
-              </m:r>
-              <m:sSup>
-                <m:e>
-                  <m:r>
-                    <m:rPr>
-                      <m:sty m:val="b"/>
-                    </m:rPr>
-                    <m:t>h</m:t>
-                  </m:r>
-                </m:e>
-                <m:sup>
-                  <m:d>
-                    <m:dPr>
-                      <m:begChr m:val="["/>
-                      <m:endChr m:val="]"/>
-                      <m:sepChr m:val=""/>
-                      <m:grow/>
-                    </m:dPr>
-                    <m:e>
-                      <m:r>
-                        <m:t>i</m:t>
-                      </m:r>
-                    </m:e>
-                  </m:d>
-                </m:sup>
-              </m:sSup>
-            </m:num>
-            <m:den>
-              <m:r>
-                <m:rPr>
-                  <m:sty m:val="p"/>
-                </m:rPr>
-                <m:t>∂</m:t>
-              </m:r>
-              <m:sSup>
-                <m:e>
-                  <m:r>
-                    <m:rPr>
-                      <m:sty m:val="b"/>
-                    </m:rPr>
-                    <m:t>z</m:t>
-                  </m:r>
-                </m:e>
-                <m:sup>
-                  <m:d>
-                    <m:dPr>
-                      <m:begChr m:val="["/>
-                      <m:endChr m:val="]"/>
-                      <m:sepChr m:val=""/>
-                      <m:grow/>
-                    </m:dPr>
-                    <m:e>
-                      <m:r>
-                        <m:t>i</m:t>
-                      </m:r>
-                    </m:e>
-                  </m:d>
-                </m:sup>
-              </m:sSup>
-            </m:den>
-          </m:f>
-          <m:r>
-            <m:t> </m:t>
-          </m:r>
-          <m:f>
-            <m:fPr>
-              <m:type m:val="bar"/>
-            </m:fPr>
-            <m:num>
-              <m:r>
-                <m:rPr>
-                  <m:sty m:val="p"/>
-                </m:rPr>
-                <m:t>∂</m:t>
-              </m:r>
-              <m:sSup>
-                <m:e>
-                  <m:r>
-                    <m:rPr>
-                      <m:sty m:val="b"/>
-                    </m:rPr>
-                    <m:t>z</m:t>
-                  </m:r>
-                </m:e>
-                <m:sup>
-                  <m:d>
-                    <m:dPr>
-                      <m:begChr m:val="["/>
-                      <m:endChr m:val="]"/>
-                      <m:sepChr m:val=""/>
-                      <m:grow/>
-                    </m:dPr>
-                    <m:e>
-                      <m:r>
-                        <m:t>i</m:t>
-                      </m:r>
-                    </m:e>
-                  </m:d>
-                </m:sup>
-              </m:sSup>
-            </m:num>
-            <m:den>
-              <m:r>
-                <m:rPr>
-                  <m:sty m:val="p"/>
-                </m:rPr>
-                <m:t>∂</m:t>
-              </m:r>
-              <m:sSup>
-                <m:e>
-                  <m:r>
-                    <m:rPr>
-                      <m:sty m:val="b"/>
-                    </m:rPr>
-                    <m:t>h</m:t>
-                  </m:r>
-                </m:e>
-                <m:sup>
-                  <m:d>
-                    <m:dPr>
-                      <m:begChr m:val="["/>
-                      <m:endChr m:val="]"/>
-                      <m:sepChr m:val=""/>
-                      <m:grow/>
-                    </m:dPr>
-                    <m:e>
-                      <m:r>
-                        <m:t>i</m:t>
-                      </m:r>
-                      <m:r>
-                        <m:rPr>
-                          <m:sty m:val="p"/>
-                        </m:rPr>
-                        <m:t>−</m:t>
-                      </m:r>
-                      <m:r>
-                        <m:t>1</m:t>
-                      </m:r>
-                    </m:e>
-                  </m:d>
-                </m:sup>
-              </m:sSup>
-            </m:den>
-          </m:f>
-          <m:r>
-            <m:rPr>
-              <m:sty m:val="p"/>
-            </m:rPr>
-            <m:t>=</m:t>
-          </m:r>
-          <m:r>
-            <m:rPr>
-              <m:sty m:val="p"/>
-            </m:rPr>
-            <m:t>diag</m:t>
-          </m:r>
-          <m:d>
-            <m:dPr>
-              <m:begChr m:val="("/>
-              <m:endChr m:val=")"/>
-              <m:sepChr m:val=""/>
-              <m:grow/>
-            </m:dPr>
-            <m:e>
-              <m:r>
-                <m:t>g</m:t>
-              </m:r>
-              <m:r>
-                <m:rPr>
-                  <m:sty m:val="p"/>
-                </m:rPr>
-                <m:t>′</m:t>
-              </m:r>
-              <m:d>
-                <m:dPr>
-                  <m:begChr m:val="("/>
-                  <m:endChr m:val=")"/>
-                  <m:sepChr m:val=""/>
-                  <m:grow/>
-                </m:dPr>
-                <m:e>
-                  <m:sSup>
-                    <m:e>
-                      <m:r>
-                        <m:rPr>
-                          <m:sty m:val="b"/>
-                        </m:rPr>
-                        <m:t>z</m:t>
-                      </m:r>
-                    </m:e>
-                    <m:sup>
-                      <m:d>
-                        <m:dPr>
-                          <m:begChr m:val="["/>
-                          <m:endChr m:val="]"/>
-                          <m:sepChr m:val=""/>
-                          <m:grow/>
-                        </m:dPr>
-                        <m:e>
-                          <m:r>
-                            <m:t>i</m:t>
-                          </m:r>
-                        </m:e>
-                      </m:d>
-                    </m:sup>
-                  </m:sSup>
-                </m:e>
-              </m:d>
-            </m:e>
-          </m:d>
-          <m:r>
-            <m:t> </m:t>
-          </m:r>
-          <m:sSup>
-            <m:e>
-              <m:r>
-                <m:t>W</m:t>
-              </m:r>
-            </m:e>
-            <m:sup>
-              <m:d>
-                <m:dPr>
-                  <m:begChr m:val="["/>
-                  <m:endChr m:val="]"/>
-                  <m:sepChr m:val=""/>
-                  <m:grow/>
-                </m:dPr>
-                <m:e>
-                  <m:r>
-                    <m:t>i</m:t>
-                  </m:r>
-                </m:e>
-              </m:d>
-            </m:sup>
-          </m:sSup>
-          <m:r>
-            <m:rPr>
-              <m:sty m:val="p"/>
-            </m:rPr>
-            <m:t>,</m:t>
-          </m:r>
+          <m:m>
+            <m:mPr>
+              <m:baseJc m:val="center"/>
+              <m:plcHide m:val="on"/>
+              <m:mcs>
+                <m:mc>
+                  <m:mcPr>
+                    <m:mcJc m:val="center"/>
+                    <m:count m:val="1"/>
+                  </m:mcPr>
+                </m:mc>
+              </m:mcs>
+            </m:mPr>
+            <m:mr>
+              <m:e>
+                <m:f>
+                  <m:fPr>
+                    <m:type m:val="bar"/>
+                  </m:fPr>
+                  <m:num>
+                    <m:r>
+                      <m:rPr>
+                        <m:sty m:val="p"/>
+                      </m:rPr>
+                      <m:t>∂</m:t>
+                    </m:r>
+                    <m:r>
+                      <m:rPr>
+                        <m:sty m:val="p"/>
+                        <m:scr m:val="script"/>
+                      </m:rPr>
+                      <m:t>L</m:t>
+                    </m:r>
+                  </m:num>
+                  <m:den>
+                    <m:r>
+                      <m:rPr>
+                        <m:sty m:val="p"/>
+                      </m:rPr>
+                      <m:t>∂</m:t>
+                    </m:r>
+                    <m:sSup>
+                      <m:e>
+                        <m:r>
+                          <m:rPr>
+                            <m:sty m:val="b"/>
+                          </m:rPr>
+                          <m:t>h</m:t>
+                        </m:r>
+                      </m:e>
+                      <m:sup>
+                        <m:d>
+                          <m:dPr>
+                            <m:begChr m:val="["/>
+                            <m:endChr m:val="]"/>
+                            <m:sepChr m:val=""/>
+                            <m:grow/>
+                          </m:dPr>
+                          <m:e>
+                            <m:r>
+                              <m:t>l</m:t>
+                            </m:r>
+                          </m:e>
+                        </m:d>
+                      </m:sup>
+                    </m:sSup>
+                  </m:den>
+                </m:f>
+                <m:r>
+                  <m:rPr>
+                    <m:sty m:val="p"/>
+                  </m:rPr>
+                  <m:t>=</m:t>
+                </m:r>
+                <m:f>
+                  <m:fPr>
+                    <m:type m:val="bar"/>
+                  </m:fPr>
+                  <m:num>
+                    <m:r>
+                      <m:rPr>
+                        <m:sty m:val="p"/>
+                      </m:rPr>
+                      <m:t>∂</m:t>
+                    </m:r>
+                    <m:r>
+                      <m:rPr>
+                        <m:sty m:val="p"/>
+                        <m:scr m:val="script"/>
+                      </m:rPr>
+                      <m:t>L</m:t>
+                    </m:r>
+                  </m:num>
+                  <m:den>
+                    <m:r>
+                      <m:rPr>
+                        <m:sty m:val="p"/>
+                      </m:rPr>
+                      <m:t>∂</m:t>
+                    </m:r>
+                    <m:sSup>
+                      <m:e>
+                        <m:r>
+                          <m:rPr>
+                            <m:sty m:val="b"/>
+                          </m:rPr>
+                          <m:t>h</m:t>
+                        </m:r>
+                      </m:e>
+                      <m:sup>
+                        <m:d>
+                          <m:dPr>
+                            <m:begChr m:val="["/>
+                            <m:endChr m:val="]"/>
+                            <m:sepChr m:val=""/>
+                            <m:grow/>
+                          </m:dPr>
+                          <m:e>
+                            <m:r>
+                              <m:t>L</m:t>
+                            </m:r>
+                          </m:e>
+                        </m:d>
+                      </m:sup>
+                    </m:sSup>
+                  </m:den>
+                </m:f>
+                <m:r>
+                  <m:t> </m:t>
+                </m:r>
+                <m:sSup>
+                  <m:e>
+                    <m:r>
+                      <m:t>J</m:t>
+                    </m:r>
+                  </m:e>
+                  <m:sup>
+                    <m:d>
+                      <m:dPr>
+                        <m:begChr m:val="["/>
+                        <m:endChr m:val="]"/>
+                        <m:sepChr m:val=""/>
+                        <m:grow/>
+                      </m:dPr>
+                      <m:e>
+                        <m:r>
+                          <m:t>L</m:t>
+                        </m:r>
+                      </m:e>
+                    </m:d>
+                  </m:sup>
+                </m:sSup>
+                <m:sSup>
+                  <m:e>
+                    <m:r>
+                      <m:t>J</m:t>
+                    </m:r>
+                  </m:e>
+                  <m:sup>
+                    <m:d>
+                      <m:dPr>
+                        <m:begChr m:val="["/>
+                        <m:endChr m:val="]"/>
+                        <m:sepChr m:val=""/>
+                        <m:grow/>
+                      </m:dPr>
+                      <m:e>
+                        <m:r>
+                          <m:t>L</m:t>
+                        </m:r>
+                        <m:r>
+                          <m:rPr>
+                            <m:sty m:val="p"/>
+                          </m:rPr>
+                          <m:t>−</m:t>
+                        </m:r>
+                        <m:r>
+                          <m:t>1</m:t>
+                        </m:r>
+                      </m:e>
+                    </m:d>
+                  </m:sup>
+                </m:sSup>
+                <m:r>
+                  <m:rPr>
+                    <m:sty m:val="p"/>
+                  </m:rPr>
+                  <m:t>⋯</m:t>
+                </m:r>
+                <m:sSup>
+                  <m:e>
+                    <m:r>
+                      <m:t>J</m:t>
+                    </m:r>
+                  </m:e>
+                  <m:sup>
+                    <m:d>
+                      <m:dPr>
+                        <m:begChr m:val="["/>
+                        <m:endChr m:val="]"/>
+                        <m:sepChr m:val=""/>
+                        <m:grow/>
+                      </m:dPr>
+                      <m:e>
+                        <m:r>
+                          <m:t>l</m:t>
+                        </m:r>
+                        <m:r>
+                          <m:rPr>
+                            <m:sty m:val="p"/>
+                          </m:rPr>
+                          <m:t>+</m:t>
+                        </m:r>
+                        <m:r>
+                          <m:t>1</m:t>
+                        </m:r>
+                      </m:e>
+                    </m:d>
+                  </m:sup>
+                </m:sSup>
+                <m:r>
+                  <m:rPr>
+                    <m:sty m:val="p"/>
+                  </m:rPr>
+                  <m:t>,</m:t>
+                </m:r>
+                <m:r>
+                  <m:t>  </m:t>
+                </m:r>
+                <m:sSup>
+                  <m:e>
+                    <m:r>
+                      <m:t>J</m:t>
+                    </m:r>
+                  </m:e>
+                  <m:sup>
+                    <m:d>
+                      <m:dPr>
+                        <m:begChr m:val="["/>
+                        <m:endChr m:val="]"/>
+                        <m:sepChr m:val=""/>
+                        <m:grow/>
+                      </m:dPr>
+                      <m:e>
+                        <m:r>
+                          <m:t>i</m:t>
+                        </m:r>
+                      </m:e>
+                    </m:d>
+                  </m:sup>
+                </m:sSup>
+                <m:r>
+                  <m:rPr>
+                    <m:sty m:val="p"/>
+                  </m:rPr>
+                  <m:t>=</m:t>
+                </m:r>
+                <m:f>
+                  <m:fPr>
+                    <m:type m:val="bar"/>
+                  </m:fPr>
+                  <m:num>
+                    <m:r>
+                      <m:rPr>
+                        <m:sty m:val="p"/>
+                      </m:rPr>
+                      <m:t>∂</m:t>
+                    </m:r>
+                    <m:sSup>
+                      <m:e>
+                        <m:r>
+                          <m:rPr>
+                            <m:sty m:val="b"/>
+                          </m:rPr>
+                          <m:t>h</m:t>
+                        </m:r>
+                      </m:e>
+                      <m:sup>
+                        <m:d>
+                          <m:dPr>
+                            <m:begChr m:val="["/>
+                            <m:endChr m:val="]"/>
+                            <m:sepChr m:val=""/>
+                            <m:grow/>
+                          </m:dPr>
+                          <m:e>
+                            <m:r>
+                              <m:t>i</m:t>
+                            </m:r>
+                          </m:e>
+                        </m:d>
+                      </m:sup>
+                    </m:sSup>
+                  </m:num>
+                  <m:den>
+                    <m:r>
+                      <m:rPr>
+                        <m:sty m:val="p"/>
+                      </m:rPr>
+                      <m:t>∂</m:t>
+                    </m:r>
+                    <m:sSup>
+                      <m:e>
+                        <m:r>
+                          <m:rPr>
+                            <m:sty m:val="b"/>
+                          </m:rPr>
+                          <m:t>z</m:t>
+                        </m:r>
+                      </m:e>
+                      <m:sup>
+                        <m:d>
+                          <m:dPr>
+                            <m:begChr m:val="["/>
+                            <m:endChr m:val="]"/>
+                            <m:sepChr m:val=""/>
+                            <m:grow/>
+                          </m:dPr>
+                          <m:e>
+                            <m:r>
+                              <m:t>i</m:t>
+                            </m:r>
+                          </m:e>
+                        </m:d>
+                      </m:sup>
+                    </m:sSup>
+                  </m:den>
+                </m:f>
+                <m:r>
+                  <m:t> </m:t>
+                </m:r>
+                <m:f>
+                  <m:fPr>
+                    <m:type m:val="bar"/>
+                  </m:fPr>
+                  <m:num>
+                    <m:r>
+                      <m:rPr>
+                        <m:sty m:val="p"/>
+                      </m:rPr>
+                      <m:t>∂</m:t>
+                    </m:r>
+                    <m:sSup>
+                      <m:e>
+                        <m:r>
+                          <m:rPr>
+                            <m:sty m:val="b"/>
+                          </m:rPr>
+                          <m:t>z</m:t>
+                        </m:r>
+                      </m:e>
+                      <m:sup>
+                        <m:d>
+                          <m:dPr>
+                            <m:begChr m:val="["/>
+                            <m:endChr m:val="]"/>
+                            <m:sepChr m:val=""/>
+                            <m:grow/>
+                          </m:dPr>
+                          <m:e>
+                            <m:r>
+                              <m:t>i</m:t>
+                            </m:r>
+                          </m:e>
+                        </m:d>
+                      </m:sup>
+                    </m:sSup>
+                  </m:num>
+                  <m:den>
+                    <m:r>
+                      <m:rPr>
+                        <m:sty m:val="p"/>
+                      </m:rPr>
+                      <m:t>∂</m:t>
+                    </m:r>
+                    <m:sSup>
+                      <m:e>
+                        <m:r>
+                          <m:rPr>
+                            <m:sty m:val="b"/>
+                          </m:rPr>
+                          <m:t>h</m:t>
+                        </m:r>
+                      </m:e>
+                      <m:sup>
+                        <m:d>
+                          <m:dPr>
+                            <m:begChr m:val="["/>
+                            <m:endChr m:val="]"/>
+                            <m:sepChr m:val=""/>
+                            <m:grow/>
+                          </m:dPr>
+                          <m:e>
+                            <m:r>
+                              <m:t>i</m:t>
+                            </m:r>
+                            <m:r>
+                              <m:rPr>
+                                <m:sty m:val="p"/>
+                              </m:rPr>
+                              <m:t>−</m:t>
+                            </m:r>
+                            <m:r>
+                              <m:t>1</m:t>
+                            </m:r>
+                          </m:e>
+                        </m:d>
+                      </m:sup>
+                    </m:sSup>
+                  </m:den>
+                </m:f>
+                <m:r>
+                  <m:rPr>
+                    <m:sty m:val="p"/>
+                  </m:rPr>
+                  <m:t>=</m:t>
+                </m:r>
+                <m:r>
+                  <m:rPr>
+                    <m:sty m:val="p"/>
+                  </m:rPr>
+                  <m:t>diag</m:t>
+                </m:r>
+                <m:d>
+                  <m:dPr>
+                    <m:begChr m:val="("/>
+                    <m:endChr m:val=")"/>
+                    <m:sepChr m:val=""/>
+                    <m:grow/>
+                  </m:dPr>
+                  <m:e>
+                    <m:r>
+                      <m:t>g</m:t>
+                    </m:r>
+                    <m:r>
+                      <m:rPr>
+                        <m:sty m:val="p"/>
+                      </m:rPr>
+                      <m:t>′</m:t>
+                    </m:r>
+                    <m:d>
+                      <m:dPr>
+                        <m:begChr m:val="("/>
+                        <m:endChr m:val=")"/>
+                        <m:sepChr m:val=""/>
+                        <m:grow/>
+                      </m:dPr>
+                      <m:e>
+                        <m:sSup>
+                          <m:e>
+                            <m:r>
+                              <m:rPr>
+                                <m:sty m:val="b"/>
+                              </m:rPr>
+                              <m:t>z</m:t>
+                            </m:r>
+                          </m:e>
+                          <m:sup>
+                            <m:d>
+                              <m:dPr>
+                                <m:begChr m:val="["/>
+                                <m:endChr m:val="]"/>
+                                <m:sepChr m:val=""/>
+                                <m:grow/>
+                              </m:dPr>
+                              <m:e>
+                                <m:r>
+                                  <m:t>i</m:t>
+                                </m:r>
+                              </m:e>
+                            </m:d>
+                          </m:sup>
+                        </m:sSup>
+                      </m:e>
+                    </m:d>
+                  </m:e>
+                </m:d>
+                <m:r>
+                  <m:t> </m:t>
+                </m:r>
+                <m:sSup>
+                  <m:e>
+                    <m:r>
+                      <m:t>W</m:t>
+                    </m:r>
+                  </m:e>
+                  <m:sup>
+                    <m:d>
+                      <m:dPr>
+                        <m:begChr m:val="["/>
+                        <m:endChr m:val="]"/>
+                        <m:sepChr m:val=""/>
+                        <m:grow/>
+                      </m:dPr>
+                      <m:e>
+                        <m:r>
+                          <m:t>i</m:t>
+                        </m:r>
+                      </m:e>
+                    </m:d>
+                  </m:sup>
+                </m:sSup>
+              </m:e>
+            </m:mr>
+            <m:mr>
+              <m:e>
+                <m:r>
+                  <m:rPr>
+                    <m:nor/>
+                    <m:sty m:val="p"/>
+                  </m:rPr>
+                  <m:t>for </m:t>
+                </m:r>
+                <m:sSup>
+                  <m:e>
+                    <m:r>
+                      <m:rPr>
+                        <m:sty m:val="b"/>
+                      </m:rPr>
+                      <m:t>h</m:t>
+                    </m:r>
+                  </m:e>
+                  <m:sup>
+                    <m:d>
+                      <m:dPr>
+                        <m:begChr m:val="["/>
+                        <m:endChr m:val="]"/>
+                        <m:sepChr m:val=""/>
+                        <m:grow/>
+                      </m:dPr>
+                      <m:e>
+                        <m:r>
+                          <m:t>i</m:t>
+                        </m:r>
+                      </m:e>
+                    </m:d>
+                  </m:sup>
+                </m:sSup>
+                <m:r>
+                  <m:rPr>
+                    <m:sty m:val="p"/>
+                  </m:rPr>
+                  <m:t>=</m:t>
+                </m:r>
+                <m:r>
+                  <m:t>g</m:t>
+                </m:r>
+                <m:d>
+                  <m:dPr>
+                    <m:begChr m:val="("/>
+                    <m:endChr m:val=")"/>
+                    <m:sepChr m:val=""/>
+                    <m:grow/>
+                  </m:dPr>
+                  <m:e>
+                    <m:sSup>
+                      <m:e>
+                        <m:r>
+                          <m:rPr>
+                            <m:sty m:val="b"/>
+                          </m:rPr>
+                          <m:t>z</m:t>
+                        </m:r>
+                      </m:e>
+                      <m:sup>
+                        <m:d>
+                          <m:dPr>
+                            <m:begChr m:val="["/>
+                            <m:endChr m:val="]"/>
+                            <m:sepChr m:val=""/>
+                            <m:grow/>
+                          </m:dPr>
+                          <m:e>
+                            <m:r>
+                              <m:t>i</m:t>
+                            </m:r>
+                          </m:e>
+                        </m:d>
+                      </m:sup>
+                    </m:sSup>
+                  </m:e>
+                </m:d>
+                <m:r>
+                  <m:rPr>
+                    <m:sty m:val="p"/>
+                  </m:rPr>
+                  <m:t>,</m:t>
+                </m:r>
+                <m:r>
+                  <m:t> </m:t>
+                </m:r>
+                <m:sSup>
+                  <m:e>
+                    <m:r>
+                      <m:rPr>
+                        <m:sty m:val="b"/>
+                      </m:rPr>
+                      <m:t>z</m:t>
+                    </m:r>
+                  </m:e>
+                  <m:sup>
+                    <m:d>
+                      <m:dPr>
+                        <m:begChr m:val="["/>
+                        <m:endChr m:val="]"/>
+                        <m:sepChr m:val=""/>
+                        <m:grow/>
+                      </m:dPr>
+                      <m:e>
+                        <m:r>
+                          <m:t>i</m:t>
+                        </m:r>
+                      </m:e>
+                    </m:d>
+                  </m:sup>
+                </m:sSup>
+                <m:r>
+                  <m:rPr>
+                    <m:sty m:val="p"/>
+                  </m:rPr>
+                  <m:t>=</m:t>
+                </m:r>
+                <m:sSup>
+                  <m:e>
+                    <m:r>
+                      <m:t>W</m:t>
+                    </m:r>
+                  </m:e>
+                  <m:sup>
+                    <m:d>
+                      <m:dPr>
+                        <m:begChr m:val="["/>
+                        <m:endChr m:val="]"/>
+                        <m:sepChr m:val=""/>
+                        <m:grow/>
+                      </m:dPr>
+                      <m:e>
+                        <m:r>
+                          <m:t>i</m:t>
+                        </m:r>
+                      </m:e>
+                    </m:d>
+                  </m:sup>
+                </m:sSup>
+                <m:sSup>
+                  <m:e>
+                    <m:r>
+                      <m:rPr>
+                        <m:sty m:val="b"/>
+                      </m:rPr>
+                      <m:t>h</m:t>
+                    </m:r>
+                  </m:e>
+                  <m:sup>
+                    <m:d>
+                      <m:dPr>
+                        <m:begChr m:val="["/>
+                        <m:endChr m:val="]"/>
+                        <m:sepChr m:val=""/>
+                        <m:grow/>
+                      </m:dPr>
+                      <m:e>
+                        <m:r>
+                          <m:t>i</m:t>
+                        </m:r>
+                        <m:r>
+                          <m:rPr>
+                            <m:sty m:val="p"/>
+                          </m:rPr>
+                          <m:t>−</m:t>
+                        </m:r>
+                        <m:r>
+                          <m:t>1</m:t>
+                        </m:r>
+                      </m:e>
+                    </m:d>
+                  </m:sup>
+                </m:sSup>
+                <m:r>
+                  <m:rPr>
+                    <m:sty m:val="p"/>
+                  </m:rPr>
+                  <m:t>+</m:t>
+                </m:r>
+                <m:sSup>
+                  <m:e>
+                    <m:r>
+                      <m:rPr>
+                        <m:sty m:val="b"/>
+                      </m:rPr>
+                      <m:t>b</m:t>
+                    </m:r>
+                  </m:e>
+                  <m:sup>
+                    <m:d>
+                      <m:dPr>
+                        <m:begChr m:val="["/>
+                        <m:endChr m:val="]"/>
+                        <m:sepChr m:val=""/>
+                        <m:grow/>
+                      </m:dPr>
+                      <m:e>
+                        <m:r>
+                          <m:t>i</m:t>
+                        </m:r>
+                      </m:e>
+                    </m:d>
+                  </m:sup>
+                </m:sSup>
+                <m:r>
+                  <m:rPr>
+                    <m:sty m:val="p"/>
+                  </m:rPr>
+                  <m:t>.</m:t>
+                </m:r>
+              </m:e>
+            </m:mr>
+          </m:m>
         </m:oMath>
       </m:oMathPara>
     </w:p>
@@ -13845,213 +14180,7 @@
         <w:pStyle w:val="FirstParagraph"/>
       </w:pPr>
       <w:r>
-        <w:t xml:space="preserve">where</w:t>
-      </w:r>
-      <w:r>
-        <w:t xml:space="preserve"> </w:t>
-      </w:r>
-      <m:oMath>
-        <m:sSup>
-          <m:e>
-            <m:r>
-              <m:rPr>
-                <m:sty m:val="b"/>
-              </m:rPr>
-              <m:t>h</m:t>
-            </m:r>
-          </m:e>
-          <m:sup>
-            <m:d>
-              <m:dPr>
-                <m:begChr m:val="["/>
-                <m:endChr m:val="]"/>
-                <m:sepChr m:val=""/>
-                <m:grow/>
-              </m:dPr>
-              <m:e>
-                <m:r>
-                  <m:t>i</m:t>
-                </m:r>
-              </m:e>
-            </m:d>
-          </m:sup>
-        </m:sSup>
-        <m:r>
-          <m:rPr>
-            <m:sty m:val="p"/>
-          </m:rPr>
-          <m:t>=</m:t>
-        </m:r>
-        <m:r>
-          <m:t>g</m:t>
-        </m:r>
-        <m:d>
-          <m:dPr>
-            <m:begChr m:val="("/>
-            <m:endChr m:val=")"/>
-            <m:sepChr m:val=""/>
-            <m:grow/>
-          </m:dPr>
-          <m:e>
-            <m:sSup>
-              <m:e>
-                <m:r>
-                  <m:rPr>
-                    <m:sty m:val="b"/>
-                  </m:rPr>
-                  <m:t>z</m:t>
-                </m:r>
-              </m:e>
-              <m:sup>
-                <m:d>
-                  <m:dPr>
-                    <m:begChr m:val="["/>
-                    <m:endChr m:val="]"/>
-                    <m:sepChr m:val=""/>
-                    <m:grow/>
-                  </m:dPr>
-                  <m:e>
-                    <m:r>
-                      <m:t>i</m:t>
-                    </m:r>
-                  </m:e>
-                </m:d>
-              </m:sup>
-            </m:sSup>
-          </m:e>
-        </m:d>
-      </m:oMath>
-      <w:r>
-        <w:t xml:space="preserve"> </w:t>
-      </w:r>
-      <w:r>
-        <w:t xml:space="preserve">and</w:t>
-      </w:r>
-      <w:r>
-        <w:t xml:space="preserve"> </w:t>
-      </w:r>
-      <m:oMath>
-        <m:sSup>
-          <m:e>
-            <m:r>
-              <m:rPr>
-                <m:sty m:val="b"/>
-              </m:rPr>
-              <m:t>z</m:t>
-            </m:r>
-          </m:e>
-          <m:sup>
-            <m:d>
-              <m:dPr>
-                <m:begChr m:val="["/>
-                <m:endChr m:val="]"/>
-                <m:sepChr m:val=""/>
-                <m:grow/>
-              </m:dPr>
-              <m:e>
-                <m:r>
-                  <m:t>i</m:t>
-                </m:r>
-              </m:e>
-            </m:d>
-          </m:sup>
-        </m:sSup>
-        <m:r>
-          <m:rPr>
-            <m:sty m:val="p"/>
-          </m:rPr>
-          <m:t>=</m:t>
-        </m:r>
-        <m:sSup>
-          <m:e>
-            <m:r>
-              <m:t>W</m:t>
-            </m:r>
-          </m:e>
-          <m:sup>
-            <m:d>
-              <m:dPr>
-                <m:begChr m:val="["/>
-                <m:endChr m:val="]"/>
-                <m:sepChr m:val=""/>
-                <m:grow/>
-              </m:dPr>
-              <m:e>
-                <m:r>
-                  <m:t>i</m:t>
-                </m:r>
-              </m:e>
-            </m:d>
-          </m:sup>
-        </m:sSup>
-        <m:sSup>
-          <m:e>
-            <m:r>
-              <m:rPr>
-                <m:sty m:val="b"/>
-              </m:rPr>
-              <m:t>h</m:t>
-            </m:r>
-          </m:e>
-          <m:sup>
-            <m:d>
-              <m:dPr>
-                <m:begChr m:val="["/>
-                <m:endChr m:val="]"/>
-                <m:sepChr m:val=""/>
-                <m:grow/>
-              </m:dPr>
-              <m:e>
-                <m:r>
-                  <m:t>i</m:t>
-                </m:r>
-                <m:r>
-                  <m:rPr>
-                    <m:sty m:val="p"/>
-                  </m:rPr>
-                  <m:t>−</m:t>
-                </m:r>
-                <m:r>
-                  <m:t>1</m:t>
-                </m:r>
-              </m:e>
-            </m:d>
-          </m:sup>
-        </m:sSup>
-        <m:r>
-          <m:rPr>
-            <m:sty m:val="p"/>
-          </m:rPr>
-          <m:t>+</m:t>
-        </m:r>
-        <m:sSup>
-          <m:e>
-            <m:r>
-              <m:rPr>
-                <m:sty m:val="b"/>
-              </m:rPr>
-              <m:t>b</m:t>
-            </m:r>
-          </m:e>
-          <m:sup>
-            <m:d>
-              <m:dPr>
-                <m:begChr m:val="["/>
-                <m:endChr m:val="]"/>
-                <m:sepChr m:val=""/>
-                <m:grow/>
-              </m:dPr>
-              <m:e>
-                <m:r>
-                  <m:t>i</m:t>
-                </m:r>
-              </m:e>
-            </m:d>
-          </m:sup>
-        </m:sSup>
-      </m:oMath>
-      <w:r>
-        <w:t xml:space="preserve">. When these factors have norm below 1, the product shrinks exponentially with depth and the early layers barely learn. RNNs have the same problem over time, because the same recurrent weight matrix enters the product once per time step.</w:t>
+        <w:t xml:space="preserve">When these factors have norm below 1, the product shrinks exponentially with depth and the early layers barely learn. RNNs have the same problem over time, because the same recurrent weight matrix enters the product once per time step.</w:t>
       </w:r>
     </w:p>
     <w:p>
@@ -17155,9 +17284,8 @@
         <m:r>
           <m:rPr>
             <m:sty m:val="p"/>
-            <m:scr m:val="script"/>
-          </m:rPr>
-          <m:t>L</m:t>
+          </m:rPr>
+          <m:t>ℓ</m:t>
         </m:r>
         <m:r>
           <m:rPr>
@@ -17255,9 +17383,8 @@
         <m:r>
           <m:rPr>
             <m:sty m:val="p"/>
-            <m:scr m:val="script"/>
-          </m:rPr>
-          <m:t>L</m:t>
+          </m:rPr>
+          <m:t>ℓ</m:t>
         </m:r>
         <m:r>
           <m:rPr>
@@ -17525,6 +17652,15 @@
       <w:pPr>
         <w:pStyle w:val="Heading1"/>
       </w:pPr>
+      <w:r>
+        <w:rPr>
+          <w:rStyle w:val="SectionNumber"/>
+        </w:rPr>
+        <w:t xml:space="preserve">4</w:t>
+      </w:r>
+      <w:r>
+        <w:tab/>
+      </w:r>
       <w:r>
         <w:t xml:space="preserve">Simulating XOR</w:t>
       </w:r>
@@ -26224,6 +26360,15 @@
         <w:pStyle w:val="Heading1"/>
       </w:pPr>
       <w:r>
+        <w:rPr>
+          <w:rStyle w:val="SectionNumber"/>
+        </w:rPr>
+        <w:t xml:space="preserve">5</w:t>
+      </w:r>
+      <w:r>
+        <w:tab/>
+      </w:r>
+      <w:r>
         <w:t xml:space="preserve">Neural Nets and Backpropagation</w:t>
       </w:r>
     </w:p>
@@ -29075,6 +29220,15 @@
       <w:pPr>
         <w:pStyle w:val="Heading1"/>
       </w:pPr>
+      <w:r>
+        <w:rPr>
+          <w:rStyle w:val="SectionNumber"/>
+        </w:rPr>
+        <w:t xml:space="preserve">6</w:t>
+      </w:r>
+      <w:r>
+        <w:tab/>
+      </w:r>
       <w:r>
         <w:t xml:space="preserve">Programming</w:t>
       </w:r>

</xml_diff>